<commit_message>
Fill report sections, add zext/trunc example and asm output
</commit_message>
<xml_diff>
--- a/LLVM-IR-Explorer/Report.docx
+++ b/LLVM-IR-Explorer/Report.docx
@@ -282,17 +282,38 @@
           <w:sz w:val="24"/>
           <w:szCs w:val="24"/>
         </w:rPr>
-        <w:t xml:space="preserve">[TODO] Summarise the LLVM source tree (llvm/, clang/, clang-tools-extra/, lib/, include/, tools/, ...) in your own words.</w:t>
-      </w:r>
-    </w:p>
-    <w:p>
-      <w:pPr>
+        <w:t xml:space="preserve">LLVM lives in the llvm-project monorepo (release/17.x was used). The parts relevant here are:</w:t>
+      </w:r>
+    </w:p>
+    <w:p>
+      <w:pPr>
+        <w:rPr>
+          <w:sz w:val="24"/>
+          <w:szCs w:val="24"/>
+        </w:rPr>
+      </w:pPr>
+      <w:r>
         <w:rPr>
           <w:b/>
           <w:bCs/>
           <w:sz w:val="24"/>
           <w:szCs w:val="24"/>
-          <w:u w:val="single"/>
+        </w:rPr>
+        <w:t xml:space="preserve">llvm/</w:t>
+      </w:r>
+      <w:r>
+        <w:rPr>
+          <w:sz w:val="24"/>
+          <w:szCs w:val="24"/>
+        </w:rPr>
+        <w:t xml:space="preserve">: the core. include/llvm/ holds the public headers (IR/, ADT/, Support/, Analysis/, Transforms/, CodeGen/, ...); lib/ holds the implementations of the same components (lib/IR for the IR classes, lib/Analysis, lib/Transforms for optimisation passes, lib/CodeGen for the backend framework and lib/Target/X86 etc. for target backends); tools/ builds the command-line programs (llc, opt, lli, llvm-as, llvm-dis); test/ and unittests/ hold the regression and unit tests; docs/ and utils/ hold documentation and helper scripts.</w:t>
+      </w:r>
+    </w:p>
+    <w:p>
+      <w:pPr>
+        <w:rPr>
+          <w:sz w:val="24"/>
+          <w:szCs w:val="24"/>
         </w:rPr>
       </w:pPr>
       <w:r>
@@ -301,9 +322,15 @@
           <w:bCs/>
           <w:sz w:val="24"/>
           <w:szCs w:val="24"/>
-          <w:u w:val="single"/>
-        </w:rPr>
-        <w:t xml:space="preserve">2. LLVM IR Study of Core C/C++ Constructs</w:t>
+        </w:rPr>
+        <w:t xml:space="preserve">clang/</w:t>
+      </w:r>
+      <w:r>
+        <w:rPr>
+          <w:sz w:val="24"/>
+          <w:szCs w:val="24"/>
+        </w:rPr>
+        <w:t xml:space="preserve">: the C-family frontend. lib/Lex (lexer, preprocessor), lib/Parse, lib/Sema (semantic analysis), lib/AST, and lib/CodeGen, which lowers the AST to LLVM IR, i.e. the part that produces the .ll files studied in this report; include/clang holds its headers and tools/ the clang driver.</w:t>
       </w:r>
     </w:p>
     <w:p>
@@ -320,8 +347,23 @@
           <w:sz w:val="24"/>
           <w:szCs w:val="24"/>
         </w:rPr>
-        <w:t>A</w:t>
-      </w:r>
+        <w:t xml:space="preserve">clang-tools-extra/</w:t>
+      </w:r>
+      <w:r>
+        <w:rPr>
+          <w:sz w:val="24"/>
+          <w:szCs w:val="24"/>
+        </w:rPr>
+        <w:t xml:space="preserve">: tools built on Clang libraries such as clang-tidy, clangd and clang-format related utilities.</w:t>
+      </w:r>
+    </w:p>
+    <w:p>
+      <w:pPr>
+        <w:rPr>
+          <w:sz w:val="24"/>
+          <w:szCs w:val="24"/>
+        </w:rPr>
+      </w:pPr>
       <w:r>
         <w:rPr>
           <w:b/>
@@ -329,14 +371,83 @@
           <w:sz w:val="24"/>
           <w:szCs w:val="24"/>
         </w:rPr>
-        <w:t>)</w:t>
-      </w:r>
-      <w:r>
+        <w:t xml:space="preserve">cmake/, runtimes/, ...</w:t>
+      </w:r>
+      <w:r>
+        <w:rPr>
+          <w:sz w:val="24"/>
+          <w:szCs w:val="24"/>
+        </w:rPr>
+        <w:t xml:space="preserve">: build-system modules and runtime libraries; only llvm, clang and clang-tools-extra are enabled through -DLLVM_ENABLE_PROJECTS="clang-tools-extra;clang".</w:t>
+      </w:r>
+    </w:p>
+    <w:p>
+      <w:pPr>
+        <w:rPr>
+          <w:sz w:val="24"/>
+          <w:szCs w:val="24"/>
+        </w:rPr>
+      </w:pPr>
+      <w:r>
+        <w:rPr>
+          <w:sz w:val="24"/>
+          <w:szCs w:val="24"/>
+        </w:rPr>
+        <w:t xml:space="preserve">Pipeline used in this report: source (.c/.cpp) -&gt; clang frontend (lex, parse, Sema, AST) -&gt; clang/lib/CodeGen -&gt; LLVM IR (.ll) -&gt; optional passes (opt) -&gt; llc backend -&gt; assembly.</w:t>
+      </w:r>
+    </w:p>
+    <w:p>
+      <w:pPr>
         <w:rPr>
           <w:b/>
           <w:bCs/>
           <w:sz w:val="24"/>
           <w:szCs w:val="24"/>
+          <w:u w:val="single"/>
+        </w:rPr>
+      </w:pPr>
+      <w:r>
+        <w:rPr>
+          <w:b/>
+          <w:bCs/>
+          <w:sz w:val="24"/>
+          <w:szCs w:val="24"/>
+          <w:u w:val="single"/>
+        </w:rPr>
+        <w:t xml:space="preserve">2. LLVM IR Study of Core C/C++ Constructs</w:t>
+      </w:r>
+    </w:p>
+    <w:p>
+      <w:pPr>
+        <w:rPr>
+          <w:sz w:val="24"/>
+          <w:szCs w:val="24"/>
+        </w:rPr>
+      </w:pPr>
+      <w:r>
+        <w:rPr>
+          <w:b/>
+          <w:bCs/>
+          <w:sz w:val="24"/>
+          <w:szCs w:val="24"/>
+        </w:rPr>
+        <w:t>A</w:t>
+      </w:r>
+      <w:r>
+        <w:rPr>
+          <w:b/>
+          <w:bCs/>
+          <w:sz w:val="24"/>
+          <w:szCs w:val="24"/>
+        </w:rPr>
+        <w:t>)</w:t>
+      </w:r>
+      <w:r>
+        <w:rPr>
+          <w:b/>
+          <w:bCs/>
+          <w:sz w:val="24"/>
+          <w:szCs w:val="24"/>
         </w:rPr>
         <w:t xml:space="preserve"> </w:t>
       </w:r>
@@ -5600,7 +5711,7 @@
           <w:sz w:val="20"/>
           <w:szCs w:val="20"/>
         </w:rPr>
-        <w:t xml:space="preserve">        square(3);</w:t>
+        <w:t xml:space="preserve">        printf("The square of 3 = %d", square(3));</w:t>
       </w:r>
     </w:p>
     <w:p>
@@ -6451,99 +6562,16 @@
     <w:p>
       <w:pPr>
         <w:rPr>
-          <w:rFonts w:cstheme="minorHAnsi"/>
-          <w:sz w:val="24"/>
-          <w:szCs w:val="24"/>
-        </w:rPr>
-      </w:pPr>
-      <w:r>
-        <w:rPr>
-          <w:rFonts w:cstheme="minorHAnsi"/>
-          <w:sz w:val="24"/>
-          <w:szCs w:val="24"/>
-        </w:rPr>
-        <w:t>When main() calls square(3), the value 3 is directed passed to the square</w:t>
-      </w:r>
-      <w:r>
-        <w:rPr>
-          <w:rFonts w:cstheme="minorHAnsi"/>
-          <w:sz w:val="24"/>
-          <w:szCs w:val="24"/>
-        </w:rPr>
-        <w:t>()</w:t>
-      </w:r>
-      <w:r>
-        <w:rPr>
-          <w:rFonts w:cstheme="minorHAnsi"/>
-          <w:sz w:val="24"/>
-          <w:szCs w:val="24"/>
-        </w:rPr>
-        <w:t xml:space="preserve"> function</w:t>
-      </w:r>
-      <w:r>
-        <w:rPr>
-          <w:rFonts w:cstheme="minorHAnsi"/>
-          <w:sz w:val="24"/>
-          <w:szCs w:val="24"/>
-        </w:rPr>
-        <w:t xml:space="preserve"> </w:t>
-      </w:r>
-      <w:r>
-        <w:rPr>
-          <w:rFonts w:cstheme="minorHAnsi"/>
-          <w:sz w:val="24"/>
-          <w:szCs w:val="24"/>
-        </w:rPr>
-        <w:t xml:space="preserve">and received as the parameter %0 inside the function. This value is then stored in %2 to which memory has been allocated and on which the required computation will be performed and the resultant value stored in %2 and returned back to the main function which called the </w:t>
-      </w:r>
-      <w:r>
-        <w:rPr>
-          <w:rFonts w:cstheme="minorHAnsi"/>
-          <w:sz w:val="24"/>
-          <w:szCs w:val="24"/>
-        </w:rPr>
-        <w:lastRenderedPageBreak/>
-        <w:t xml:space="preserve">square function. The main function receives this value using the call </w:t>
-      </w:r>
-      <w:r>
-        <w:rPr>
-          <w:rFonts w:cstheme="minorHAnsi"/>
-          <w:sz w:val="24"/>
-          <w:szCs w:val="24"/>
-        </w:rPr>
-        <w:t>instruction</w:t>
-      </w:r>
-      <w:r>
-        <w:rPr>
-          <w:rFonts w:cstheme="minorHAnsi"/>
-          <w:sz w:val="24"/>
-          <w:szCs w:val="24"/>
-        </w:rPr>
-        <w:t xml:space="preserve"> in register %2</w:t>
-      </w:r>
-      <w:r>
-        <w:rPr>
-          <w:rFonts w:cstheme="minorHAnsi"/>
-          <w:sz w:val="24"/>
-          <w:szCs w:val="24"/>
-        </w:rPr>
-        <w:t xml:space="preserve"> which can then be used for further computation </w:t>
-      </w:r>
-      <w:r>
-        <w:rPr>
-          <w:rFonts w:cstheme="minorHAnsi"/>
-          <w:sz w:val="24"/>
-          <w:szCs w:val="24"/>
-        </w:rPr>
-        <w:t>or passed to another function</w:t>
-      </w:r>
-      <w:r>
-        <w:rPr>
-          <w:rFonts w:cstheme="minorHAnsi"/>
-          <w:sz w:val="24"/>
-          <w:szCs w:val="24"/>
-        </w:rPr>
-        <w:t>.</w:t>
+          <w:sz w:val="24"/>
+          <w:szCs w:val="24"/>
+        </w:rPr>
+      </w:pPr>
+      <w:r>
+        <w:rPr>
+          <w:sz w:val="24"/>
+          <w:szCs w:val="24"/>
+        </w:rPr>
+        <w:t xml:space="preserve">When main() calls square(3), the constant 3 is passed by value as the argument %0 of square(). Inside square(), %0 is first stored into a local stack slot (%2) and then loaded twice for the multiplication; the product is the register %5, which is handed back with ret i32 %5. In main(), the call instruction itself yields the returned value as the register %2, which is then passed by value as the second argument of the printf call (%3 = call i32 (ptr, ...) @printf(ptr noundef @.str, i32 noundef %2)). So arguments travel as SSA values in the call, and the result travels back as the value of the call instruction.</w:t>
       </w:r>
     </w:p>
     <w:p>
@@ -6615,43 +6643,35 @@
     <w:p>
       <w:pPr>
         <w:rPr>
-          <w:rFonts w:ascii="Consolas" w:hAnsi="Consolas" w:cstheme="minorHAnsi"/>
-          <w:sz w:val="20"/>
-          <w:szCs w:val="20"/>
-        </w:rPr>
-      </w:pPr>
-      <w:r>
-        <w:rPr>
-          <w:rFonts w:ascii="Consolas" w:hAnsi="Consolas" w:cstheme="minorHAnsi"/>
-          <w:sz w:val="20"/>
-          <w:szCs w:val="20"/>
-        </w:rPr>
-        <w:t>ret i32 %5 ; return result of square</w:t>
-      </w:r>
-      <w:r>
-        <w:rPr>
-          <w:rFonts w:ascii="Consolas" w:hAnsi="Consolas" w:cstheme="minorHAnsi"/>
-          <w:sz w:val="20"/>
-          <w:szCs w:val="20"/>
-        </w:rPr>
-        <w:br/>
-        <w:t xml:space="preserve">ret i32 0 </w:t>
-      </w:r>
-      <w:r>
-        <w:rPr>
-          <w:rFonts w:ascii="Consolas" w:hAnsi="Consolas" w:cstheme="minorHAnsi"/>
-          <w:sz w:val="20"/>
-          <w:szCs w:val="20"/>
-        </w:rPr>
-        <w:t xml:space="preserve"> </w:t>
-      </w:r>
-      <w:r>
-        <w:rPr>
-          <w:rFonts w:ascii="Consolas" w:hAnsi="Consolas" w:cstheme="minorHAnsi"/>
-          <w:sz w:val="20"/>
-          <w:szCs w:val="20"/>
-        </w:rPr>
-        <w:t>; return from main</w:t>
+          <w:rFonts w:ascii="Consolas" w:hAnsi="Consolas"/>
+          <w:sz w:val="20"/>
+          <w:szCs w:val="20"/>
+        </w:rPr>
+      </w:pPr>
+      <w:r>
+        <w:rPr>
+          <w:rFonts w:ascii="Consolas" w:hAnsi="Consolas"/>
+          <w:sz w:val="20"/>
+          <w:szCs w:val="20"/>
+        </w:rPr>
+        <w:t xml:space="preserve">ret i32 %5   ; return result of square</w:t>
+      </w:r>
+    </w:p>
+    <w:p>
+      <w:pPr>
+        <w:rPr>
+          <w:rFonts w:ascii="Consolas" w:hAnsi="Consolas"/>
+          <w:sz w:val="20"/>
+          <w:szCs w:val="20"/>
+        </w:rPr>
+      </w:pPr>
+      <w:r>
+        <w:rPr>
+          <w:rFonts w:ascii="Consolas" w:hAnsi="Consolas"/>
+          <w:sz w:val="20"/>
+          <w:szCs w:val="20"/>
+        </w:rPr>
+        <w:t xml:space="preserve">ret i32 0    ; return from main</w:t>
       </w:r>
     </w:p>
     <w:p>
@@ -7587,36 +7607,167 @@
     <w:p>
       <w:pPr>
         <w:rPr>
-          <w:rFonts w:cstheme="minorHAnsi"/>
-          <w:sz w:val="24"/>
-          <w:szCs w:val="24"/>
-        </w:rPr>
-      </w:pPr>
-      <w:r>
-        <w:rPr>
-          <w:rFonts w:cstheme="minorHAnsi"/>
-          <w:sz w:val="24"/>
-          <w:szCs w:val="24"/>
-        </w:rPr>
-        <w:t xml:space="preserve">This one did not appear in my code. However, on further research I figured out that </w:t>
-      </w:r>
-      <w:proofErr w:type="spellStart"/>
-      <w:r>
-        <w:rPr>
-          <w:rFonts w:cstheme="minorHAnsi"/>
-          <w:sz w:val="24"/>
-          <w:szCs w:val="24"/>
-        </w:rPr>
-        <w:t>zext</w:t>
-      </w:r>
-      <w:proofErr w:type="spellEnd"/>
-      <w:r>
-        <w:rPr>
-          <w:rFonts w:cstheme="minorHAnsi"/>
-          <w:sz w:val="24"/>
-          <w:szCs w:val="24"/>
-        </w:rPr>
-        <w:t xml:space="preserve"> (zero extension) is used to extend unsigned integers by filling higher bits with 0’s.</w:t>
+          <w:sz w:val="24"/>
+          <w:szCs w:val="24"/>
+        </w:rPr>
+      </w:pPr>
+      <w:r>
+        <w:rPr>
+          <w:sz w:val="24"/>
+          <w:szCs w:val="24"/>
+        </w:rPr>
+        <w:t xml:space="preserve">Q1d.c has no zero extension, so a small extra program Q1e.c was written (compiled the same way, see run.sh):</w:t>
+      </w:r>
+    </w:p>
+    <w:p>
+      <w:pPr>
+        <w:rPr>
+          <w:rFonts w:ascii="Consolas" w:hAnsi="Consolas"/>
+          <w:sz w:val="20"/>
+          <w:szCs w:val="20"/>
+        </w:rPr>
+      </w:pPr>
+      <w:r>
+        <w:rPr>
+          <w:rFonts w:ascii="Consolas" w:hAnsi="Consolas"/>
+          <w:sz w:val="20"/>
+          <w:szCs w:val="20"/>
+        </w:rPr>
+        <w:t xml:space="preserve">unsigned char uc = 200;</w:t>
+      </w:r>
+    </w:p>
+    <w:p>
+      <w:pPr>
+        <w:rPr>
+          <w:rFonts w:ascii="Consolas" w:hAnsi="Consolas"/>
+          <w:sz w:val="20"/>
+          <w:szCs w:val="20"/>
+        </w:rPr>
+      </w:pPr>
+      <w:r>
+        <w:rPr>
+          <w:rFonts w:ascii="Consolas" w:hAnsi="Consolas"/>
+          <w:sz w:val="20"/>
+          <w:szCs w:val="20"/>
+        </w:rPr>
+        <w:t xml:space="preserve">unsigned int ui = uc;   // widening of an unsigned value</w:t>
+      </w:r>
+    </w:p>
+    <w:p>
+      <w:pPr>
+        <w:rPr>
+          <w:rFonts w:ascii="Consolas" w:hAnsi="Consolas"/>
+          <w:sz w:val="20"/>
+          <w:szCs w:val="20"/>
+        </w:rPr>
+      </w:pPr>
+      <w:r>
+        <w:rPr>
+          <w:rFonts w:ascii="Consolas" w:hAnsi="Consolas"/>
+          <w:sz w:val="20"/>
+          <w:szCs w:val="20"/>
+        </w:rPr>
+        <w:t xml:space="preserve">int a = 1, b = 2;</w:t>
+      </w:r>
+    </w:p>
+    <w:p>
+      <w:pPr>
+        <w:rPr>
+          <w:rFonts w:ascii="Consolas" w:hAnsi="Consolas"/>
+          <w:sz w:val="20"/>
+          <w:szCs w:val="20"/>
+        </w:rPr>
+      </w:pPr>
+      <w:r>
+        <w:rPr>
+          <w:rFonts w:ascii="Consolas" w:hAnsi="Consolas"/>
+          <w:sz w:val="20"/>
+          <w:szCs w:val="20"/>
+        </w:rPr>
+        <w:t xml:space="preserve">int r = (a &lt; b);        // comparison result (i1) used as an int</w:t>
+      </w:r>
+    </w:p>
+    <w:p>
+      <w:pPr>
+        <w:rPr>
+          <w:rFonts w:ascii="Consolas" w:hAnsi="Consolas"/>
+          <w:sz w:val="20"/>
+          <w:szCs w:val="20"/>
+        </w:rPr>
+      </w:pPr>
+      <w:r>
+        <w:rPr>
+          <w:rFonts w:ascii="Consolas" w:hAnsi="Consolas"/>
+          <w:sz w:val="20"/>
+          <w:szCs w:val="20"/>
+        </w:rPr>
+        <w:t xml:space="preserve">  %9 = load i8, ptr %2, align 1</w:t>
+      </w:r>
+    </w:p>
+    <w:p>
+      <w:pPr>
+        <w:rPr>
+          <w:rFonts w:ascii="Consolas" w:hAnsi="Consolas"/>
+          <w:sz w:val="20"/>
+          <w:szCs w:val="20"/>
+        </w:rPr>
+      </w:pPr>
+      <w:r>
+        <w:rPr>
+          <w:rFonts w:ascii="Consolas" w:hAnsi="Consolas"/>
+          <w:sz w:val="20"/>
+          <w:szCs w:val="20"/>
+        </w:rPr>
+        <w:t xml:space="preserve">  %10 = zext i8 %9 to i32          ; unsigned char -&gt; unsigned int</w:t>
+      </w:r>
+    </w:p>
+    <w:p>
+      <w:pPr>
+        <w:rPr>
+          <w:rFonts w:ascii="Consolas" w:hAnsi="Consolas"/>
+          <w:sz w:val="20"/>
+          <w:szCs w:val="20"/>
+        </w:rPr>
+      </w:pPr>
+      <w:r>
+        <w:rPr>
+          <w:rFonts w:ascii="Consolas" w:hAnsi="Consolas"/>
+          <w:sz w:val="20"/>
+          <w:szCs w:val="20"/>
+        </w:rPr>
+        <w:t xml:space="preserve">  %15 = icmp slt i32 %13, %14       ; the comparison yields an i1</w:t>
+      </w:r>
+    </w:p>
+    <w:p>
+      <w:pPr>
+        <w:rPr>
+          <w:rFonts w:ascii="Consolas" w:hAnsi="Consolas"/>
+          <w:sz w:val="20"/>
+          <w:szCs w:val="20"/>
+        </w:rPr>
+      </w:pPr>
+      <w:r>
+        <w:rPr>
+          <w:rFonts w:ascii="Consolas" w:hAnsi="Consolas"/>
+          <w:sz w:val="20"/>
+          <w:szCs w:val="20"/>
+        </w:rPr>
+        <w:t xml:space="preserve">  %16 = zext i1 %15 to i32          ; i1 -&gt; int (0 or 1)</w:t>
+      </w:r>
+    </w:p>
+    <w:p>
+      <w:pPr>
+        <w:rPr>
+          <w:sz w:val="24"/>
+          <w:szCs w:val="24"/>
+        </w:rPr>
+      </w:pPr>
+      <w:r>
+        <w:rPr>
+          <w:sz w:val="24"/>
+          <w:szCs w:val="24"/>
+        </w:rPr>
+        <w:t xml:space="preserve">The instruction zext (zero extension) is chosen when the source value is unsigned (or is an i1 boolean), because the new high bits must be filled with 0 and not with the sign bit. Clang uses sext for signed sources and zext for unsigned ones.</w:t>
       </w:r>
     </w:p>
     <w:p>
@@ -7714,68 +7865,99 @@
     <w:p>
       <w:pPr>
         <w:rPr>
-          <w:rFonts w:cstheme="minorHAnsi"/>
-          <w:sz w:val="24"/>
-          <w:szCs w:val="24"/>
-        </w:rPr>
-      </w:pPr>
-      <w:r>
-        <w:rPr>
-          <w:rFonts w:cstheme="minorHAnsi"/>
-          <w:sz w:val="24"/>
-          <w:szCs w:val="24"/>
-        </w:rPr>
-        <w:t xml:space="preserve">This one did not appear in my code. However, on further research I figured out that </w:t>
-      </w:r>
-      <w:proofErr w:type="spellStart"/>
-      <w:r>
-        <w:rPr>
-          <w:rFonts w:cstheme="minorHAnsi"/>
-          <w:sz w:val="24"/>
-          <w:szCs w:val="24"/>
-        </w:rPr>
-        <w:t>trunc</w:t>
-      </w:r>
-      <w:proofErr w:type="spellEnd"/>
-      <w:r>
-        <w:rPr>
-          <w:rFonts w:cstheme="minorHAnsi"/>
-          <w:sz w:val="24"/>
-          <w:szCs w:val="24"/>
-        </w:rPr>
-        <w:t xml:space="preserve"> (</w:t>
-      </w:r>
-      <w:r>
-        <w:rPr>
-          <w:rFonts w:cstheme="minorHAnsi"/>
-          <w:sz w:val="24"/>
-          <w:szCs w:val="24"/>
-        </w:rPr>
-        <w:t>truncate</w:t>
-      </w:r>
-      <w:r>
-        <w:rPr>
-          <w:rFonts w:cstheme="minorHAnsi"/>
-          <w:sz w:val="24"/>
-          <w:szCs w:val="24"/>
-        </w:rPr>
-        <w:t xml:space="preserve">) is used to </w:t>
-      </w:r>
-      <w:r>
-        <w:rPr>
-          <w:rFonts w:cstheme="minorHAnsi"/>
-          <w:sz w:val="24"/>
-          <w:szCs w:val="24"/>
-        </w:rPr>
-        <w:t>convert a larger integer type to a smaller one by discarding higher bits</w:t>
-      </w:r>
-      <w:r>
-        <w:rPr>
-          <w:rFonts w:cstheme="minorHAnsi"/>
-          <w:sz w:val="24"/>
-          <w:szCs w:val="24"/>
-        </w:rPr>
-        <w:t>.</w:t>
+          <w:sz w:val="24"/>
+          <w:szCs w:val="24"/>
+        </w:rPr>
+      </w:pPr>
+      <w:r>
+        <w:rPr>
+          <w:sz w:val="24"/>
+          <w:szCs w:val="24"/>
+        </w:rPr>
+        <w:t xml:space="preserve">Also taken from Q1e.c:</w:t>
+      </w:r>
+    </w:p>
+    <w:p>
+      <w:pPr>
+        <w:rPr>
+          <w:rFonts w:ascii="Consolas" w:hAnsi="Consolas"/>
+          <w:sz w:val="20"/>
+          <w:szCs w:val="20"/>
+        </w:rPr>
+      </w:pPr>
+      <w:r>
+        <w:rPr>
+          <w:rFonts w:ascii="Consolas" w:hAnsi="Consolas"/>
+          <w:sz w:val="20"/>
+          <w:szCs w:val="20"/>
+        </w:rPr>
+        <w:t xml:space="preserve">int i = 300;</w:t>
+      </w:r>
+    </w:p>
+    <w:p>
+      <w:pPr>
+        <w:rPr>
+          <w:rFonts w:ascii="Consolas" w:hAnsi="Consolas"/>
+          <w:sz w:val="20"/>
+          <w:szCs w:val="20"/>
+        </w:rPr>
+      </w:pPr>
+      <w:r>
+        <w:rPr>
+          <w:rFonts w:ascii="Consolas" w:hAnsi="Consolas"/>
+          <w:sz w:val="20"/>
+          <w:szCs w:val="20"/>
+        </w:rPr>
+        <w:t xml:space="preserve">char c = (char) i;      // narrowing</w:t>
+      </w:r>
+    </w:p>
+    <w:p>
+      <w:pPr>
+        <w:rPr>
+          <w:rFonts w:ascii="Consolas" w:hAnsi="Consolas"/>
+          <w:sz w:val="20"/>
+          <w:szCs w:val="20"/>
+        </w:rPr>
+      </w:pPr>
+      <w:r>
+        <w:rPr>
+          <w:rFonts w:ascii="Consolas" w:hAnsi="Consolas"/>
+          <w:sz w:val="20"/>
+          <w:szCs w:val="20"/>
+        </w:rPr>
+        <w:t xml:space="preserve">  %11 = load i32, ptr %4, align 4</w:t>
+      </w:r>
+    </w:p>
+    <w:p>
+      <w:pPr>
+        <w:rPr>
+          <w:rFonts w:ascii="Consolas" w:hAnsi="Consolas"/>
+          <w:sz w:val="20"/>
+          <w:szCs w:val="20"/>
+        </w:rPr>
+      </w:pPr>
+      <w:r>
+        <w:rPr>
+          <w:rFonts w:ascii="Consolas" w:hAnsi="Consolas"/>
+          <w:sz w:val="20"/>
+          <w:szCs w:val="20"/>
+        </w:rPr>
+        <w:t xml:space="preserve">  %12 = trunc i32 %11 to i8         ; keep only the low 8 bits (300 -&gt; 44)</w:t>
+      </w:r>
+    </w:p>
+    <w:p>
+      <w:pPr>
+        <w:rPr>
+          <w:sz w:val="24"/>
+          <w:szCs w:val="24"/>
+        </w:rPr>
+      </w:pPr>
+      <w:r>
+        <w:rPr>
+          <w:sz w:val="24"/>
+          <w:szCs w:val="24"/>
+        </w:rPr>
+        <w:t xml:space="preserve">The instruction trunc (truncate) is chosen when a wider integer is converted to a narrower one: the high bits are discarded and only the low bits are kept, so the value can change (300 becomes 44 in an 8-bit char).</w:t>
       </w:r>
     </w:p>
     <w:p>
@@ -8976,59 +9158,52 @@
     <w:p>
       <w:pPr>
         <w:rPr>
-          <w:rFonts w:cstheme="minorHAnsi"/>
-          <w:sz w:val="24"/>
-          <w:szCs w:val="24"/>
-        </w:rPr>
-      </w:pPr>
-      <w:r>
-        <w:rPr>
-          <w:rFonts w:cstheme="minorHAnsi"/>
-          <w:sz w:val="24"/>
-          <w:szCs w:val="24"/>
-        </w:rPr>
-        <w:t xml:space="preserve">Dynamic Allocation: </w:t>
-      </w:r>
-      <w:r>
-        <w:rPr>
-          <w:rFonts w:cstheme="minorHAnsi"/>
-          <w:sz w:val="24"/>
-          <w:szCs w:val="24"/>
-        </w:rPr>
-        <w:t xml:space="preserve"> </w:t>
-      </w:r>
-      <w:r>
-        <w:rPr>
-          <w:rFonts w:ascii="Consolas" w:hAnsi="Consolas" w:cstheme="minorHAnsi"/>
-          <w:sz w:val="20"/>
-          <w:szCs w:val="20"/>
-        </w:rPr>
-        <w:t>declare noalias ptr @malloc(i64 noundef) #1</w:t>
-      </w:r>
-      <w:r>
-        <w:rPr>
-          <w:rFonts w:ascii="Consolas" w:hAnsi="Consolas" w:cstheme="minorHAnsi"/>
-          <w:sz w:val="20"/>
-          <w:szCs w:val="20"/>
-        </w:rPr>
-        <w:t xml:space="preserve">                         </w:t>
-      </w:r>
-      <w:r>
-        <w:rPr>
-          <w:rFonts w:ascii="Consolas" w:hAnsi="Consolas" w:cstheme="minorHAnsi"/>
-          <w:sz w:val="20"/>
-          <w:szCs w:val="20"/>
-        </w:rPr>
-        <w:t>%8 = call noalias ptr @malloc(i64 noundef 20)</w:t>
-      </w:r>
-      <w:r>
-        <w:rPr>
-          <w:rFonts w:ascii="Consolas" w:hAnsi="Consolas" w:cstheme="minorHAnsi"/>
-          <w:sz w:val="20"/>
-          <w:szCs w:val="20"/>
-        </w:rPr>
-        <w:br/>
-        <w:t>store ptr %8, ptr %3</w:t>
+          <w:rFonts w:ascii="Consolas" w:hAnsi="Consolas"/>
+          <w:sz w:val="20"/>
+          <w:szCs w:val="20"/>
+        </w:rPr>
+      </w:pPr>
+      <w:r>
+        <w:rPr>
+          <w:rFonts w:ascii="Consolas" w:hAnsi="Consolas"/>
+          <w:sz w:val="20"/>
+          <w:szCs w:val="20"/>
+        </w:rPr>
+        <w:t xml:space="preserve">declare noalias ptr @malloc(i64 noundef) #1</w:t>
+      </w:r>
+    </w:p>
+    <w:p>
+      <w:pPr>
+        <w:rPr>
+          <w:rFonts w:ascii="Consolas" w:hAnsi="Consolas"/>
+          <w:sz w:val="20"/>
+          <w:szCs w:val="20"/>
+        </w:rPr>
+      </w:pPr>
+      <w:r>
+        <w:rPr>
+          <w:rFonts w:ascii="Consolas" w:hAnsi="Consolas"/>
+          <w:sz w:val="20"/>
+          <w:szCs w:val="20"/>
+        </w:rPr>
+        <w:t xml:space="preserve">%8 = call noalias ptr @malloc(i64 noundef 20)</w:t>
+      </w:r>
+    </w:p>
+    <w:p>
+      <w:pPr>
+        <w:rPr>
+          <w:rFonts w:ascii="Consolas" w:hAnsi="Consolas"/>
+          <w:sz w:val="20"/>
+          <w:szCs w:val="20"/>
+        </w:rPr>
+      </w:pPr>
+      <w:r>
+        <w:rPr>
+          <w:rFonts w:ascii="Consolas" w:hAnsi="Consolas"/>
+          <w:sz w:val="20"/>
+          <w:szCs w:val="20"/>
+        </w:rPr>
+        <w:t xml:space="preserve">store ptr %8, ptr %3</w:t>
       </w:r>
     </w:p>
     <w:p>
@@ -10046,27 +10221,35 @@
     <w:p>
       <w:pPr>
         <w:rPr>
-          <w:rFonts w:ascii="Consolas" w:hAnsi="Consolas" w:cstheme="minorHAnsi"/>
-          <w:sz w:val="20"/>
-          <w:szCs w:val="20"/>
-        </w:rPr>
-      </w:pPr>
-      <w:r>
-        <w:rPr>
-          <w:rFonts w:ascii="Consolas" w:hAnsi="Consolas" w:cstheme="minorHAnsi"/>
-          <w:sz w:val="20"/>
-          <w:szCs w:val="20"/>
-        </w:rPr>
-        <w:t>%2 = alloca %struct.Point, align 4</w:t>
-      </w:r>
-      <w:r>
-        <w:rPr>
-          <w:rFonts w:ascii="Consolas" w:hAnsi="Consolas" w:cstheme="minorHAnsi"/>
-          <w:sz w:val="20"/>
-          <w:szCs w:val="20"/>
-        </w:rPr>
-        <w:br/>
-        <w:t>store i32 1, ptr %3, align 4</w:t>
+          <w:rFonts w:ascii="Consolas" w:hAnsi="Consolas"/>
+          <w:sz w:val="20"/>
+          <w:szCs w:val="20"/>
+        </w:rPr>
+      </w:pPr>
+      <w:r>
+        <w:rPr>
+          <w:rFonts w:ascii="Consolas" w:hAnsi="Consolas"/>
+          <w:sz w:val="20"/>
+          <w:szCs w:val="20"/>
+        </w:rPr>
+        <w:t xml:space="preserve">%2 = alloca %struct.Point, align 4</w:t>
+      </w:r>
+    </w:p>
+    <w:p>
+      <w:pPr>
+        <w:rPr>
+          <w:rFonts w:ascii="Consolas" w:hAnsi="Consolas"/>
+          <w:sz w:val="20"/>
+          <w:szCs w:val="20"/>
+        </w:rPr>
+      </w:pPr>
+      <w:r>
+        <w:rPr>
+          <w:rFonts w:ascii="Consolas" w:hAnsi="Consolas"/>
+          <w:sz w:val="20"/>
+          <w:szCs w:val="20"/>
+        </w:rPr>
+        <w:t xml:space="preserve">store i32 1, ptr %3, align 4</w:t>
       </w:r>
     </w:p>
     <w:p>
@@ -10521,35 +10704,52 @@
     <w:p>
       <w:pPr>
         <w:rPr>
-          <w:rFonts w:ascii="Consolas" w:hAnsi="Consolas" w:cstheme="minorHAnsi"/>
-          <w:sz w:val="20"/>
-          <w:szCs w:val="20"/>
-        </w:rPr>
-      </w:pPr>
-      <w:r>
-        <w:rPr>
-          <w:rFonts w:cstheme="minorHAnsi"/>
-          <w:sz w:val="24"/>
-          <w:szCs w:val="24"/>
-        </w:rPr>
-        <w:t xml:space="preserve">Struct/Class access: </w:t>
-      </w:r>
-      <w:r>
-        <w:rPr>
-          <w:rFonts w:ascii="Consolas" w:hAnsi="Consolas" w:cstheme="minorHAnsi"/>
-          <w:sz w:val="20"/>
-          <w:szCs w:val="20"/>
-        </w:rPr>
-        <w:t>%3 = getelementptr inbounds %struct.Point, ptr %2, i32 0, i32 0</w:t>
-      </w:r>
-      <w:r>
-        <w:rPr>
-          <w:rFonts w:ascii="Consolas" w:hAnsi="Consolas" w:cstheme="minorHAnsi"/>
-          <w:sz w:val="20"/>
-          <w:szCs w:val="20"/>
-        </w:rPr>
-        <w:br/>
-        <w:t>%4 = getelementptr inbounds %struct.Point, ptr %2, i32 0, i32 1</w:t>
+          <w:rFonts w:ascii="Consolas" w:hAnsi="Consolas"/>
+          <w:sz w:val="20"/>
+          <w:szCs w:val="20"/>
+        </w:rPr>
+      </w:pPr>
+      <w:r>
+        <w:rPr>
+          <w:rFonts w:ascii="Consolas" w:hAnsi="Consolas"/>
+          <w:sz w:val="20"/>
+          <w:szCs w:val="20"/>
+        </w:rPr>
+        <w:t xml:space="preserve">Struct/Class access:</w:t>
+      </w:r>
+    </w:p>
+    <w:p>
+      <w:pPr>
+        <w:rPr>
+          <w:rFonts w:ascii="Consolas" w:hAnsi="Consolas"/>
+          <w:sz w:val="20"/>
+          <w:szCs w:val="20"/>
+        </w:rPr>
+      </w:pPr>
+      <w:r>
+        <w:rPr>
+          <w:rFonts w:ascii="Consolas" w:hAnsi="Consolas"/>
+          <w:sz w:val="20"/>
+          <w:szCs w:val="20"/>
+        </w:rPr>
+        <w:t xml:space="preserve">%3 = getelementptr inbounds %struct.Point, ptr %2, i32 0, i32 0</w:t>
+      </w:r>
+    </w:p>
+    <w:p>
+      <w:pPr>
+        <w:rPr>
+          <w:rFonts w:ascii="Consolas" w:hAnsi="Consolas"/>
+          <w:sz w:val="20"/>
+          <w:szCs w:val="20"/>
+        </w:rPr>
+      </w:pPr>
+      <w:r>
+        <w:rPr>
+          <w:rFonts w:ascii="Consolas" w:hAnsi="Consolas"/>
+          <w:sz w:val="20"/>
+          <w:szCs w:val="20"/>
+        </w:rPr>
+        <w:t xml:space="preserve">%4 = getelementptr inbounds %struct.Point, ptr %2, i32 0, i32 1</w:t>
       </w:r>
     </w:p>
     <w:p>
@@ -10730,29 +10930,367 @@
     <w:p>
       <w:pPr>
         <w:rPr>
-          <w:sz w:val="24"/>
-          <w:szCs w:val="24"/>
-        </w:rPr>
-      </w:pPr>
-      <w:r>
-        <w:rPr>
-          <w:sz w:val="24"/>
-          <w:szCs w:val="24"/>
-        </w:rPr>
-        <w:t xml:space="preserve">[TODO] Add code, IR snippets (Q2c_vector.ll) and explanation.</w:t>
-      </w:r>
-    </w:p>
-    <w:p>
-      <w:pPr>
+          <w:rFonts w:ascii="Consolas" w:hAnsi="Consolas"/>
+          <w:sz w:val="20"/>
+          <w:szCs w:val="20"/>
+        </w:rPr>
+      </w:pPr>
+      <w:r>
+        <w:rPr>
+          <w:rFonts w:ascii="Consolas" w:hAnsi="Consolas"/>
+          <w:sz w:val="20"/>
+          <w:szCs w:val="20"/>
+        </w:rPr>
+        <w:t xml:space="preserve">#include &lt;vector&gt;</w:t>
+      </w:r>
+    </w:p>
+    <w:p>
+      <w:pPr>
+        <w:rPr>
+          <w:rFonts w:ascii="Consolas" w:hAnsi="Consolas"/>
+          <w:sz w:val="20"/>
+          <w:szCs w:val="20"/>
+        </w:rPr>
+      </w:pPr>
+      <w:r>
+        <w:rPr>
+          <w:rFonts w:ascii="Consolas" w:hAnsi="Consolas"/>
+          <w:sz w:val="20"/>
+          <w:szCs w:val="20"/>
+        </w:rPr>
+        <w:t xml:space="preserve">int main(){</w:t>
+      </w:r>
+    </w:p>
+    <w:p>
+      <w:pPr>
+        <w:rPr>
+          <w:rFonts w:ascii="Consolas" w:hAnsi="Consolas"/>
+          <w:sz w:val="20"/>
+          <w:szCs w:val="20"/>
+        </w:rPr>
+      </w:pPr>
+      <w:r>
+        <w:rPr>
+          <w:rFonts w:ascii="Consolas" w:hAnsi="Consolas"/>
+          <w:sz w:val="20"/>
+          <w:szCs w:val="20"/>
+        </w:rPr>
+        <w:t xml:space="preserve">        std::vector&lt;int&gt; v;</w:t>
+      </w:r>
+    </w:p>
+    <w:p>
+      <w:pPr>
+        <w:rPr>
+          <w:rFonts w:ascii="Consolas" w:hAnsi="Consolas"/>
+          <w:sz w:val="20"/>
+          <w:szCs w:val="20"/>
+        </w:rPr>
+      </w:pPr>
+      <w:r>
+        <w:rPr>
+          <w:rFonts w:ascii="Consolas" w:hAnsi="Consolas"/>
+          <w:sz w:val="20"/>
+          <w:szCs w:val="20"/>
+        </w:rPr>
+        <w:t xml:space="preserve">        v.push_back(1);</w:t>
+      </w:r>
+    </w:p>
+    <w:p>
+      <w:pPr>
+        <w:rPr>
+          <w:rFonts w:ascii="Consolas" w:hAnsi="Consolas"/>
+          <w:sz w:val="20"/>
+          <w:szCs w:val="20"/>
+        </w:rPr>
+      </w:pPr>
+      <w:r>
+        <w:rPr>
+          <w:rFonts w:ascii="Consolas" w:hAnsi="Consolas"/>
+          <w:sz w:val="20"/>
+          <w:szCs w:val="20"/>
+        </w:rPr>
+        <w:t xml:space="preserve">        v.push_back(2);</w:t>
+      </w:r>
+    </w:p>
+    <w:p>
+      <w:pPr>
+        <w:rPr>
+          <w:rFonts w:ascii="Consolas" w:hAnsi="Consolas"/>
+          <w:sz w:val="20"/>
+          <w:szCs w:val="20"/>
+        </w:rPr>
+      </w:pPr>
+      <w:r>
+        <w:rPr>
+          <w:rFonts w:ascii="Consolas" w:hAnsi="Consolas"/>
+          <w:sz w:val="20"/>
+          <w:szCs w:val="20"/>
+        </w:rPr>
+        <w:t xml:space="preserve">        int x = v[1];</w:t>
+      </w:r>
+    </w:p>
+    <w:p>
+      <w:pPr>
+        <w:rPr>
+          <w:rFonts w:ascii="Consolas" w:hAnsi="Consolas"/>
+          <w:sz w:val="20"/>
+          <w:szCs w:val="20"/>
+        </w:rPr>
+      </w:pPr>
+      <w:r>
+        <w:rPr>
+          <w:rFonts w:ascii="Consolas" w:hAnsi="Consolas"/>
+          <w:sz w:val="20"/>
+          <w:szCs w:val="20"/>
+        </w:rPr>
+        <w:t xml:space="preserve">        return x;</w:t>
+      </w:r>
+    </w:p>
+    <w:p>
+      <w:pPr>
+        <w:rPr>
+          <w:rFonts w:ascii="Consolas" w:hAnsi="Consolas"/>
+          <w:sz w:val="20"/>
+          <w:szCs w:val="20"/>
+        </w:rPr>
+      </w:pPr>
+      <w:r>
+        <w:rPr>
+          <w:rFonts w:ascii="Consolas" w:hAnsi="Consolas"/>
+          <w:sz w:val="20"/>
+          <w:szCs w:val="20"/>
+        </w:rPr>
+        <w:t xml:space="preserve">}</w:t>
+      </w:r>
+    </w:p>
+    <w:p>
+      <w:pPr>
+        <w:rPr>
+          <w:sz w:val="24"/>
+          <w:szCs w:val="24"/>
+        </w:rPr>
+      </w:pPr>
+      <w:r>
+        <w:rPr>
+          <w:sz w:val="24"/>
+          <w:szCs w:val="24"/>
+        </w:rPr>
+        <w:t xml:space="preserve">IR Code Snippets in Q2c_vector.ll (attributes such as noundef/nonnull/dereferenceable shortened to ...):</w:t>
+      </w:r>
+    </w:p>
+    <w:p>
+      <w:pPr>
+        <w:rPr>
+          <w:rFonts w:ascii="Consolas" w:hAnsi="Consolas"/>
+          <w:sz w:val="20"/>
+          <w:szCs w:val="20"/>
+        </w:rPr>
+      </w:pPr>
+      <w:r>
+        <w:rPr>
+          <w:rFonts w:ascii="Consolas" w:hAnsi="Consolas"/>
+          <w:sz w:val="20"/>
+          <w:szCs w:val="20"/>
+        </w:rPr>
+        <w:t xml:space="preserve">%"class.std::vector" = type { %"struct.std::_Vector_base" }</w:t>
+      </w:r>
+    </w:p>
+    <w:p>
+      <w:pPr>
+        <w:rPr>
+          <w:rFonts w:ascii="Consolas" w:hAnsi="Consolas"/>
+          <w:sz w:val="20"/>
+          <w:szCs w:val="20"/>
+        </w:rPr>
+      </w:pPr>
+      <w:r>
+        <w:rPr>
+          <w:rFonts w:ascii="Consolas" w:hAnsi="Consolas"/>
+          <w:sz w:val="20"/>
+          <w:szCs w:val="20"/>
+        </w:rPr>
+        <w:t xml:space="preserve">%"struct.std::_Vector_base&lt;int, std::allocator&lt;int&gt;&gt;::_Vector_impl_data" = type { ptr, ptr, ptr }  ; begin, end, end_of_storage</w:t>
+      </w:r>
+    </w:p>
+    <w:p>
+      <w:pPr>
+        <w:rPr>
+          <w:rFonts w:ascii="Consolas" w:hAnsi="Consolas"/>
+          <w:sz w:val="20"/>
+          <w:szCs w:val="20"/>
+        </w:rPr>
+      </w:pPr>
+      <w:r>
+        <w:rPr>
+          <w:rFonts w:ascii="Consolas" w:hAnsi="Consolas"/>
+          <w:sz w:val="20"/>
+          <w:szCs w:val="20"/>
+        </w:rPr>
+        <w:t xml:space="preserve">%2 = alloca %"class.std::vector", align 8             ; the vector object itself: three pointers on the stack</w:t>
+      </w:r>
+    </w:p>
+    <w:p>
+      <w:pPr>
+        <w:rPr>
+          <w:rFonts w:ascii="Consolas" w:hAnsi="Consolas"/>
+          <w:sz w:val="20"/>
+          <w:szCs w:val="20"/>
+        </w:rPr>
+      </w:pPr>
+      <w:r>
+        <w:rPr>
+          <w:rFonts w:ascii="Consolas" w:hAnsi="Consolas"/>
+          <w:sz w:val="20"/>
+          <w:szCs w:val="20"/>
+        </w:rPr>
+        <w:t xml:space="preserve">call void @_ZNSt6vectorIiSaIiEEC2Ev(ptr ... %2)         ; constructor</w:t>
+      </w:r>
+    </w:p>
+    <w:p>
+      <w:pPr>
+        <w:rPr>
+          <w:rFonts w:ascii="Consolas" w:hAnsi="Consolas"/>
+          <w:sz w:val="20"/>
+          <w:szCs w:val="20"/>
+        </w:rPr>
+      </w:pPr>
+      <w:r>
+        <w:rPr>
+          <w:rFonts w:ascii="Consolas" w:hAnsi="Consolas"/>
+          <w:sz w:val="20"/>
+          <w:szCs w:val="20"/>
+        </w:rPr>
+        <w:t xml:space="preserve">invoke void @_ZNSt6vectorIiSaIiEE9push_backEOi(ptr ... %2, ptr ... %3) to label %8 unwind label %14   ; v.push_back(1)</w:t>
+      </w:r>
+    </w:p>
+    <w:p>
+      <w:pPr>
+        <w:rPr>
+          <w:rFonts w:ascii="Consolas" w:hAnsi="Consolas"/>
+          <w:sz w:val="20"/>
+          <w:szCs w:val="20"/>
+        </w:rPr>
+      </w:pPr>
+      <w:r>
+        <w:rPr>
+          <w:rFonts w:ascii="Consolas" w:hAnsi="Consolas"/>
+          <w:sz w:val="20"/>
+          <w:szCs w:val="20"/>
+        </w:rPr>
+        <w:t xml:space="preserve">%10 = call ptr @_ZNSt6vectorIiSaIiEEixEm(ptr ... %2, i64 noundef 1)   ; v[1] returns a pointer to the element</w:t>
+      </w:r>
+    </w:p>
+    <w:p>
+      <w:pPr>
+        <w:rPr>
+          <w:rFonts w:ascii="Consolas" w:hAnsi="Consolas"/>
+          <w:sz w:val="20"/>
+          <w:szCs w:val="20"/>
+        </w:rPr>
+      </w:pPr>
+      <w:r>
+        <w:rPr>
+          <w:rFonts w:ascii="Consolas" w:hAnsi="Consolas"/>
+          <w:sz w:val="20"/>
+          <w:szCs w:val="20"/>
+        </w:rPr>
+        <w:t xml:space="preserve">%11 = load i32, ptr %10, align 4</w:t>
+      </w:r>
+    </w:p>
+    <w:p>
+      <w:pPr>
+        <w:rPr>
+          <w:rFonts w:ascii="Consolas" w:hAnsi="Consolas"/>
+          <w:sz w:val="20"/>
+          <w:szCs w:val="20"/>
+        </w:rPr>
+      </w:pPr>
+      <w:r>
+        <w:rPr>
+          <w:rFonts w:ascii="Consolas" w:hAnsi="Consolas"/>
+          <w:sz w:val="20"/>
+          <w:szCs w:val="20"/>
+        </w:rPr>
+        <w:t xml:space="preserve">call void @_ZNSt6vectorIiSaIiEED2Ev(ptr ... %2)         ; destructor</w:t>
+      </w:r>
+    </w:p>
+    <w:p>
+      <w:pPr>
+        <w:rPr>
+          <w:rFonts w:ascii="Consolas" w:hAnsi="Consolas"/>
+          <w:sz w:val="20"/>
+          <w:szCs w:val="20"/>
+        </w:rPr>
+      </w:pPr>
+      <w:r>
+        <w:rPr>
+          <w:rFonts w:ascii="Consolas" w:hAnsi="Consolas"/>
+          <w:sz w:val="20"/>
+          <w:szCs w:val="20"/>
+        </w:rPr>
+        <w:t xml:space="preserve">; body of operator[]:</w:t>
+      </w:r>
+    </w:p>
+    <w:p>
+      <w:pPr>
+        <w:rPr>
+          <w:rFonts w:ascii="Consolas" w:hAnsi="Consolas"/>
+          <w:sz w:val="20"/>
+          <w:szCs w:val="20"/>
+        </w:rPr>
+      </w:pPr>
+      <w:r>
+        <w:rPr>
+          <w:rFonts w:ascii="Consolas" w:hAnsi="Consolas"/>
+          <w:sz w:val="20"/>
+          <w:szCs w:val="20"/>
+        </w:rPr>
+        <w:t xml:space="preserve">%8 = load ptr, ptr %7, align 8                           ; load the begin pointer</w:t>
+      </w:r>
+    </w:p>
+    <w:p>
+      <w:pPr>
+        <w:rPr>
+          <w:rFonts w:ascii="Consolas" w:hAnsi="Consolas"/>
+          <w:sz w:val="20"/>
+          <w:szCs w:val="20"/>
+        </w:rPr>
+      </w:pPr>
+      <w:r>
+        <w:rPr>
+          <w:rFonts w:ascii="Consolas" w:hAnsi="Consolas"/>
+          <w:sz w:val="20"/>
+          <w:szCs w:val="20"/>
+        </w:rPr>
+        <w:t xml:space="preserve">%10 = getelementptr inbounds i32, ptr %8, i64 %9         ; &amp;begin[index]</w:t>
+      </w:r>
+    </w:p>
+    <w:p>
+      <w:pPr>
+        <w:rPr>
+          <w:sz w:val="24"/>
+          <w:szCs w:val="24"/>
+        </w:rPr>
+      </w:pPr>
+      <w:r>
         <w:rPr>
           <w:b/>
           <w:bCs/>
           <w:sz w:val="24"/>
           <w:szCs w:val="24"/>
-          <w:u w:val="single"/>
-        </w:rPr>
-      </w:pPr>
-      <w:r>
+        </w:rPr>
+        <w:t xml:space="preserve">Explanation: </w:t>
+      </w:r>
+      <w:r>
+        <w:rPr>
+          <w:sz w:val="24"/>
+          <w:szCs w:val="24"/>
+        </w:rPr>
+        <w:t xml:space="preserve">std::vector is not a built-in type. It is an ordinary C++ class template, so Clang lowers it like any class: a nested set of named struct types whose innermost layout is three pointers (begin, end, end_of_storage), 24 bytes in total. Construction, push_back, operator[] and destruction all appear as calls to the (mangled) member functions of the instantiated template, and the push_back calls use invoke with a landingpad cleanup block because they may throw. The elements live on the heap: the allocation goes through operator new (_Znwm) inside the library code, and operator[] simply loads the begin pointer and applies a one-index getelementptr to it.</w:t>
+      </w:r>
+    </w:p>
+    <w:p>
+      <w:pPr>
         <w:rPr>
           <w:b/>
           <w:bCs/>
@@ -10760,26 +11298,8 @@
           <w:szCs w:val="24"/>
           <w:u w:val="single"/>
         </w:rPr>
-        <w:t xml:space="preserve">D) C Code in Q2d_union.c (union)</w:t>
-      </w:r>
-    </w:p>
-    <w:p>
-      <w:pPr>
-        <w:rPr>
-          <w:sz w:val="24"/>
-          <w:szCs w:val="24"/>
-        </w:rPr>
-      </w:pPr>
-      <w:r>
-        <w:rPr>
-          <w:sz w:val="24"/>
-          <w:szCs w:val="24"/>
-        </w:rPr>
-        <w:t xml:space="preserve">[TODO] Add code, IR snippets (Q2d_union.ll) and explanation.</w:t>
-      </w:r>
-    </w:p>
-    <w:p>
-      <w:pPr>
+      </w:pPr>
+      <w:r>
         <w:rPr>
           <w:b/>
           <w:bCs/>
@@ -10787,6 +11307,285 @@
           <w:szCs w:val="24"/>
           <w:u w:val="single"/>
         </w:rPr>
+        <w:t xml:space="preserve">D) C Code in Q2d_union.c (union)</w:t>
+      </w:r>
+    </w:p>
+    <w:p>
+      <w:pPr>
+        <w:rPr>
+          <w:rFonts w:ascii="Consolas" w:hAnsi="Consolas"/>
+          <w:sz w:val="20"/>
+          <w:szCs w:val="20"/>
+        </w:rPr>
+      </w:pPr>
+      <w:r>
+        <w:rPr>
+          <w:rFonts w:ascii="Consolas" w:hAnsi="Consolas"/>
+          <w:sz w:val="20"/>
+          <w:szCs w:val="20"/>
+        </w:rPr>
+        <w:t xml:space="preserve">union Data{</w:t>
+      </w:r>
+    </w:p>
+    <w:p>
+      <w:pPr>
+        <w:rPr>
+          <w:rFonts w:ascii="Consolas" w:hAnsi="Consolas"/>
+          <w:sz w:val="20"/>
+          <w:szCs w:val="20"/>
+        </w:rPr>
+      </w:pPr>
+      <w:r>
+        <w:rPr>
+          <w:rFonts w:ascii="Consolas" w:hAnsi="Consolas"/>
+          <w:sz w:val="20"/>
+          <w:szCs w:val="20"/>
+        </w:rPr>
+        <w:t xml:space="preserve">        int i;</w:t>
+      </w:r>
+    </w:p>
+    <w:p>
+      <w:pPr>
+        <w:rPr>
+          <w:rFonts w:ascii="Consolas" w:hAnsi="Consolas"/>
+          <w:sz w:val="20"/>
+          <w:szCs w:val="20"/>
+        </w:rPr>
+      </w:pPr>
+      <w:r>
+        <w:rPr>
+          <w:rFonts w:ascii="Consolas" w:hAnsi="Consolas"/>
+          <w:sz w:val="20"/>
+          <w:szCs w:val="20"/>
+        </w:rPr>
+        <w:t xml:space="preserve">        float f;</w:t>
+      </w:r>
+    </w:p>
+    <w:p>
+      <w:pPr>
+        <w:rPr>
+          <w:rFonts w:ascii="Consolas" w:hAnsi="Consolas"/>
+          <w:sz w:val="20"/>
+          <w:szCs w:val="20"/>
+        </w:rPr>
+      </w:pPr>
+      <w:r>
+        <w:rPr>
+          <w:rFonts w:ascii="Consolas" w:hAnsi="Consolas"/>
+          <w:sz w:val="20"/>
+          <w:szCs w:val="20"/>
+        </w:rPr>
+        <w:t xml:space="preserve">        char c[8];</w:t>
+      </w:r>
+    </w:p>
+    <w:p>
+      <w:pPr>
+        <w:rPr>
+          <w:rFonts w:ascii="Consolas" w:hAnsi="Consolas"/>
+          <w:sz w:val="20"/>
+          <w:szCs w:val="20"/>
+        </w:rPr>
+      </w:pPr>
+      <w:r>
+        <w:rPr>
+          <w:rFonts w:ascii="Consolas" w:hAnsi="Consolas"/>
+          <w:sz w:val="20"/>
+          <w:szCs w:val="20"/>
+        </w:rPr>
+        <w:t xml:space="preserve">};</w:t>
+      </w:r>
+    </w:p>
+    <w:p>
+      <w:pPr>
+        <w:rPr>
+          <w:rFonts w:ascii="Consolas" w:hAnsi="Consolas"/>
+          <w:sz w:val="20"/>
+          <w:szCs w:val="20"/>
+        </w:rPr>
+      </w:pPr>
+      <w:r>
+        <w:rPr>
+          <w:rFonts w:ascii="Consolas" w:hAnsi="Consolas"/>
+          <w:sz w:val="20"/>
+          <w:szCs w:val="20"/>
+        </w:rPr>
+        <w:t xml:space="preserve">int main(){</w:t>
+      </w:r>
+    </w:p>
+    <w:p>
+      <w:pPr>
+        <w:rPr>
+          <w:rFonts w:ascii="Consolas" w:hAnsi="Consolas"/>
+          <w:sz w:val="20"/>
+          <w:szCs w:val="20"/>
+        </w:rPr>
+      </w:pPr>
+      <w:r>
+        <w:rPr>
+          <w:rFonts w:ascii="Consolas" w:hAnsi="Consolas"/>
+          <w:sz w:val="20"/>
+          <w:szCs w:val="20"/>
+        </w:rPr>
+        <w:t xml:space="preserve">        union Data d;</w:t>
+      </w:r>
+    </w:p>
+    <w:p>
+      <w:pPr>
+        <w:rPr>
+          <w:rFonts w:ascii="Consolas" w:hAnsi="Consolas"/>
+          <w:sz w:val="20"/>
+          <w:szCs w:val="20"/>
+        </w:rPr>
+      </w:pPr>
+      <w:r>
+        <w:rPr>
+          <w:rFonts w:ascii="Consolas" w:hAnsi="Consolas"/>
+          <w:sz w:val="20"/>
+          <w:szCs w:val="20"/>
+        </w:rPr>
+        <w:t xml:space="preserve">        d.i = 1;</w:t>
+      </w:r>
+    </w:p>
+    <w:p>
+      <w:pPr>
+        <w:rPr>
+          <w:rFonts w:ascii="Consolas" w:hAnsi="Consolas"/>
+          <w:sz w:val="20"/>
+          <w:szCs w:val="20"/>
+        </w:rPr>
+      </w:pPr>
+      <w:r>
+        <w:rPr>
+          <w:rFonts w:ascii="Consolas" w:hAnsi="Consolas"/>
+          <w:sz w:val="20"/>
+          <w:szCs w:val="20"/>
+        </w:rPr>
+        <w:t xml:space="preserve">        d.f = 2.0f;</w:t>
+      </w:r>
+    </w:p>
+    <w:p>
+      <w:pPr>
+        <w:rPr>
+          <w:rFonts w:ascii="Consolas" w:hAnsi="Consolas"/>
+          <w:sz w:val="20"/>
+          <w:szCs w:val="20"/>
+        </w:rPr>
+      </w:pPr>
+      <w:r>
+        <w:rPr>
+          <w:rFonts w:ascii="Consolas" w:hAnsi="Consolas"/>
+          <w:sz w:val="20"/>
+          <w:szCs w:val="20"/>
+        </w:rPr>
+        <w:t xml:space="preserve">        return 0;</w:t>
+      </w:r>
+    </w:p>
+    <w:p>
+      <w:pPr>
+        <w:rPr>
+          <w:rFonts w:ascii="Consolas" w:hAnsi="Consolas"/>
+          <w:sz w:val="20"/>
+          <w:szCs w:val="20"/>
+        </w:rPr>
+      </w:pPr>
+      <w:r>
+        <w:rPr>
+          <w:rFonts w:ascii="Consolas" w:hAnsi="Consolas"/>
+          <w:sz w:val="20"/>
+          <w:szCs w:val="20"/>
+        </w:rPr>
+        <w:t xml:space="preserve">}</w:t>
+      </w:r>
+    </w:p>
+    <w:p>
+      <w:pPr>
+        <w:rPr>
+          <w:sz w:val="24"/>
+          <w:szCs w:val="24"/>
+        </w:rPr>
+      </w:pPr>
+      <w:r>
+        <w:rPr>
+          <w:sz w:val="24"/>
+          <w:szCs w:val="24"/>
+        </w:rPr>
+        <w:t xml:space="preserve">IR Code Snippets in Q2d_union.ll:</w:t>
+      </w:r>
+    </w:p>
+    <w:p>
+      <w:pPr>
+        <w:rPr>
+          <w:rFonts w:ascii="Consolas" w:hAnsi="Consolas"/>
+          <w:sz w:val="20"/>
+          <w:szCs w:val="20"/>
+        </w:rPr>
+      </w:pPr>
+      <w:r>
+        <w:rPr>
+          <w:rFonts w:ascii="Consolas" w:hAnsi="Consolas"/>
+          <w:sz w:val="20"/>
+          <w:szCs w:val="20"/>
+        </w:rPr>
+        <w:t xml:space="preserve">%union.Data = type { i32, [4 x i8] }       ; union type: one i32 plus 4 bytes of padding</w:t>
+      </w:r>
+    </w:p>
+    <w:p>
+      <w:pPr>
+        <w:rPr>
+          <w:rFonts w:ascii="Consolas" w:hAnsi="Consolas"/>
+          <w:sz w:val="20"/>
+          <w:szCs w:val="20"/>
+        </w:rPr>
+      </w:pPr>
+      <w:r>
+        <w:rPr>
+          <w:rFonts w:ascii="Consolas" w:hAnsi="Consolas"/>
+          <w:sz w:val="20"/>
+          <w:szCs w:val="20"/>
+        </w:rPr>
+        <w:t xml:space="preserve">%2 = alloca %union.Data, align 4            ; size 8, alignment 4</w:t>
+      </w:r>
+    </w:p>
+    <w:p>
+      <w:pPr>
+        <w:rPr>
+          <w:rFonts w:ascii="Consolas" w:hAnsi="Consolas"/>
+          <w:sz w:val="20"/>
+          <w:szCs w:val="20"/>
+        </w:rPr>
+      </w:pPr>
+      <w:r>
+        <w:rPr>
+          <w:rFonts w:ascii="Consolas" w:hAnsi="Consolas"/>
+          <w:sz w:val="20"/>
+          <w:szCs w:val="20"/>
+        </w:rPr>
+        <w:t xml:space="preserve">store i32 1, ptr %2, align 4                ; d.i = 1</w:t>
+      </w:r>
+    </w:p>
+    <w:p>
+      <w:pPr>
+        <w:rPr>
+          <w:rFonts w:ascii="Consolas" w:hAnsi="Consolas"/>
+          <w:sz w:val="20"/>
+          <w:szCs w:val="20"/>
+        </w:rPr>
+      </w:pPr>
+      <w:r>
+        <w:rPr>
+          <w:rFonts w:ascii="Consolas" w:hAnsi="Consolas"/>
+          <w:sz w:val="20"/>
+          <w:szCs w:val="20"/>
+        </w:rPr>
+        <w:t xml:space="preserve">store float 2.000000e+00, ptr %2, align 4   ; d.f = 2.0f  (same address, different type)</w:t>
+      </w:r>
+    </w:p>
+    <w:p>
+      <w:pPr>
+        <w:rPr>
+          <w:sz w:val="24"/>
+          <w:szCs w:val="24"/>
+        </w:rPr>
       </w:pPr>
       <w:r>
         <w:rPr>
@@ -10794,24 +11593,15 @@
           <w:bCs/>
           <w:sz w:val="24"/>
           <w:szCs w:val="24"/>
-          <w:u w:val="single"/>
-        </w:rPr>
-        <w:t xml:space="preserve">E) C++ Code in Q2e_struct_class.cpp (struct vs class)</w:t>
-      </w:r>
-    </w:p>
-    <w:p>
-      <w:pPr>
-        <w:rPr>
-          <w:sz w:val="24"/>
-          <w:szCs w:val="24"/>
-        </w:rPr>
-      </w:pPr>
-      <w:r>
-        <w:rPr>
-          <w:sz w:val="24"/>
-          <w:szCs w:val="24"/>
-        </w:rPr>
-        <w:t xml:space="preserve">[TODO] Add code and IR snippets (Q2e_struct_class.ll).</w:t>
+        </w:rPr>
+        <w:t xml:space="preserve">Explanation: </w:t>
+      </w:r>
+      <w:r>
+        <w:rPr>
+          <w:sz w:val="24"/>
+          <w:szCs w:val="24"/>
+        </w:rPr>
+        <w:t xml:space="preserve">LLVM IR has no union type. Clang represents a union as a struct with a single storage member and accesses every field through the same address %2 using differently typed loads and stores (no getelementptr is needed, as both stores above show).</w:t>
       </w:r>
     </w:p>
     <w:p>
@@ -10832,65 +11622,526 @@
           <w:szCs w:val="24"/>
           <w:u w:val="single"/>
         </w:rPr>
-        <w:t xml:space="preserve">Answers to 3(b), 3(c), 3(d)</w:t>
-      </w:r>
-    </w:p>
-    <w:p>
-      <w:pPr>
-        <w:rPr>
-          <w:sz w:val="24"/>
-          <w:szCs w:val="24"/>
-        </w:rPr>
-      </w:pPr>
-      <w:r>
-        <w:rPr>
-          <w:sz w:val="24"/>
-          <w:szCs w:val="24"/>
-        </w:rPr>
-        <w:t xml:space="preserve">[TODO] 3(b) Difference between arrays and vectors in LLVM IR.</w:t>
-      </w:r>
-    </w:p>
-    <w:p>
-      <w:pPr>
-        <w:rPr>
-          <w:sz w:val="24"/>
-          <w:szCs w:val="24"/>
-        </w:rPr>
-      </w:pPr>
-      <w:r>
-        <w:rPr>
-          <w:sz w:val="24"/>
-          <w:szCs w:val="24"/>
-        </w:rPr>
-        <w:t xml:space="preserve">[TODO] 3(c) How the type of a union is determined in LLVM IR.</w:t>
-      </w:r>
-    </w:p>
-    <w:p>
-      <w:pPr>
-        <w:rPr>
-          <w:sz w:val="24"/>
-          <w:szCs w:val="24"/>
-        </w:rPr>
-      </w:pPr>
-      <w:r>
-        <w:rPr>
-          <w:sz w:val="24"/>
-          <w:szCs w:val="24"/>
-        </w:rPr>
-        <w:t xml:space="preserve">[TODO] 3(d) Differences between struct and class once lowered to LLVM IR.</w:t>
-      </w:r>
-    </w:p>
-    <w:p>
-      <w:pPr>
+        <w:t xml:space="preserve">E) C++ Code in Q2e_struct_class.cpp (struct vs class)</w:t>
+      </w:r>
+    </w:p>
+    <w:p>
+      <w:pPr>
+        <w:rPr>
+          <w:rFonts w:ascii="Consolas" w:hAnsi="Consolas"/>
+          <w:sz w:val="20"/>
+          <w:szCs w:val="20"/>
+        </w:rPr>
+      </w:pPr>
+      <w:r>
+        <w:rPr>
+          <w:rFonts w:ascii="Consolas" w:hAnsi="Consolas"/>
+          <w:sz w:val="20"/>
+          <w:szCs w:val="20"/>
+        </w:rPr>
+        <w:t xml:space="preserve">struct S{</w:t>
+      </w:r>
+    </w:p>
+    <w:p>
+      <w:pPr>
+        <w:rPr>
+          <w:rFonts w:ascii="Consolas" w:hAnsi="Consolas"/>
+          <w:sz w:val="20"/>
+          <w:szCs w:val="20"/>
+        </w:rPr>
+      </w:pPr>
+      <w:r>
+        <w:rPr>
+          <w:rFonts w:ascii="Consolas" w:hAnsi="Consolas"/>
+          <w:sz w:val="20"/>
+          <w:szCs w:val="20"/>
+        </w:rPr>
+        <w:t xml:space="preserve">        int x;</w:t>
+      </w:r>
+    </w:p>
+    <w:p>
+      <w:pPr>
+        <w:rPr>
+          <w:rFonts w:ascii="Consolas" w:hAnsi="Consolas"/>
+          <w:sz w:val="20"/>
+          <w:szCs w:val="20"/>
+        </w:rPr>
+      </w:pPr>
+      <w:r>
+        <w:rPr>
+          <w:rFonts w:ascii="Consolas" w:hAnsi="Consolas"/>
+          <w:sz w:val="20"/>
+          <w:szCs w:val="20"/>
+        </w:rPr>
+        <w:t xml:space="preserve">        int y;</w:t>
+      </w:r>
+    </w:p>
+    <w:p>
+      <w:pPr>
+        <w:rPr>
+          <w:rFonts w:ascii="Consolas" w:hAnsi="Consolas"/>
+          <w:sz w:val="20"/>
+          <w:szCs w:val="20"/>
+        </w:rPr>
+      </w:pPr>
+      <w:r>
+        <w:rPr>
+          <w:rFonts w:ascii="Consolas" w:hAnsi="Consolas"/>
+          <w:sz w:val="20"/>
+          <w:szCs w:val="20"/>
+        </w:rPr>
+        <w:t xml:space="preserve">};</w:t>
+      </w:r>
+    </w:p>
+    <w:p>
+      <w:pPr>
+        <w:rPr>
+          <w:rFonts w:ascii="Consolas" w:hAnsi="Consolas"/>
+          <w:sz w:val="20"/>
+          <w:szCs w:val="20"/>
+        </w:rPr>
+      </w:pPr>
+      <w:r>
+        <w:rPr>
+          <w:rFonts w:ascii="Consolas" w:hAnsi="Consolas"/>
+          <w:sz w:val="20"/>
+          <w:szCs w:val="20"/>
+        </w:rPr>
+        <w:t xml:space="preserve">class C{</w:t>
+      </w:r>
+    </w:p>
+    <w:p>
+      <w:pPr>
+        <w:rPr>
+          <w:rFonts w:ascii="Consolas" w:hAnsi="Consolas"/>
+          <w:sz w:val="20"/>
+          <w:szCs w:val="20"/>
+        </w:rPr>
+      </w:pPr>
+      <w:r>
+        <w:rPr>
+          <w:rFonts w:ascii="Consolas" w:hAnsi="Consolas"/>
+          <w:sz w:val="20"/>
+          <w:szCs w:val="20"/>
+        </w:rPr>
+        <w:t xml:space="preserve">        int x;</w:t>
+      </w:r>
+    </w:p>
+    <w:p>
+      <w:pPr>
+        <w:rPr>
+          <w:rFonts w:ascii="Consolas" w:hAnsi="Consolas"/>
+          <w:sz w:val="20"/>
+          <w:szCs w:val="20"/>
+        </w:rPr>
+      </w:pPr>
+      <w:r>
+        <w:rPr>
+          <w:rFonts w:ascii="Consolas" w:hAnsi="Consolas"/>
+          <w:sz w:val="20"/>
+          <w:szCs w:val="20"/>
+        </w:rPr>
+        <w:t xml:space="preserve">        int y;</w:t>
+      </w:r>
+    </w:p>
+    <w:p>
+      <w:pPr>
+        <w:rPr>
+          <w:rFonts w:ascii="Consolas" w:hAnsi="Consolas"/>
+          <w:sz w:val="20"/>
+          <w:szCs w:val="20"/>
+        </w:rPr>
+      </w:pPr>
+      <w:r>
+        <w:rPr>
+          <w:rFonts w:ascii="Consolas" w:hAnsi="Consolas"/>
+          <w:sz w:val="20"/>
+          <w:szCs w:val="20"/>
+        </w:rPr>
+        <w:t xml:space="preserve">public:</w:t>
+      </w:r>
+    </w:p>
+    <w:p>
+      <w:pPr>
+        <w:rPr>
+          <w:rFonts w:ascii="Consolas" w:hAnsi="Consolas"/>
+          <w:sz w:val="20"/>
+          <w:szCs w:val="20"/>
+        </w:rPr>
+      </w:pPr>
+      <w:r>
+        <w:rPr>
+          <w:rFonts w:ascii="Consolas" w:hAnsi="Consolas"/>
+          <w:sz w:val="20"/>
+          <w:szCs w:val="20"/>
+        </w:rPr>
+        <w:t xml:space="preserve">        void set(){ x = 1; y = 2; }</w:t>
+      </w:r>
+    </w:p>
+    <w:p>
+      <w:pPr>
+        <w:rPr>
+          <w:rFonts w:ascii="Consolas" w:hAnsi="Consolas"/>
+          <w:sz w:val="20"/>
+          <w:szCs w:val="20"/>
+        </w:rPr>
+      </w:pPr>
+      <w:r>
+        <w:rPr>
+          <w:rFonts w:ascii="Consolas" w:hAnsi="Consolas"/>
+          <w:sz w:val="20"/>
+          <w:szCs w:val="20"/>
+        </w:rPr>
+        <w:t xml:space="preserve">};</w:t>
+      </w:r>
+    </w:p>
+    <w:p>
+      <w:pPr>
+        <w:rPr>
+          <w:rFonts w:ascii="Consolas" w:hAnsi="Consolas"/>
+          <w:sz w:val="20"/>
+          <w:szCs w:val="20"/>
+        </w:rPr>
+      </w:pPr>
+      <w:r>
+        <w:rPr>
+          <w:rFonts w:ascii="Consolas" w:hAnsi="Consolas"/>
+          <w:sz w:val="20"/>
+          <w:szCs w:val="20"/>
+        </w:rPr>
+        <w:t xml:space="preserve">int main(){</w:t>
+      </w:r>
+    </w:p>
+    <w:p>
+      <w:pPr>
+        <w:rPr>
+          <w:rFonts w:ascii="Consolas" w:hAnsi="Consolas"/>
+          <w:sz w:val="20"/>
+          <w:szCs w:val="20"/>
+        </w:rPr>
+      </w:pPr>
+      <w:r>
+        <w:rPr>
+          <w:rFonts w:ascii="Consolas" w:hAnsi="Consolas"/>
+          <w:sz w:val="20"/>
+          <w:szCs w:val="20"/>
+        </w:rPr>
+        <w:t xml:space="preserve">        S s;</w:t>
+      </w:r>
+    </w:p>
+    <w:p>
+      <w:pPr>
+        <w:rPr>
+          <w:rFonts w:ascii="Consolas" w:hAnsi="Consolas"/>
+          <w:sz w:val="20"/>
+          <w:szCs w:val="20"/>
+        </w:rPr>
+      </w:pPr>
+      <w:r>
+        <w:rPr>
+          <w:rFonts w:ascii="Consolas" w:hAnsi="Consolas"/>
+          <w:sz w:val="20"/>
+          <w:szCs w:val="20"/>
+        </w:rPr>
+        <w:t xml:space="preserve">        s.x = 1;</w:t>
+      </w:r>
+    </w:p>
+    <w:p>
+      <w:pPr>
+        <w:rPr>
+          <w:rFonts w:ascii="Consolas" w:hAnsi="Consolas"/>
+          <w:sz w:val="20"/>
+          <w:szCs w:val="20"/>
+        </w:rPr>
+      </w:pPr>
+      <w:r>
+        <w:rPr>
+          <w:rFonts w:ascii="Consolas" w:hAnsi="Consolas"/>
+          <w:sz w:val="20"/>
+          <w:szCs w:val="20"/>
+        </w:rPr>
+        <w:t xml:space="preserve">        C c;</w:t>
+      </w:r>
+    </w:p>
+    <w:p>
+      <w:pPr>
+        <w:rPr>
+          <w:rFonts w:ascii="Consolas" w:hAnsi="Consolas"/>
+          <w:sz w:val="20"/>
+          <w:szCs w:val="20"/>
+        </w:rPr>
+      </w:pPr>
+      <w:r>
+        <w:rPr>
+          <w:rFonts w:ascii="Consolas" w:hAnsi="Consolas"/>
+          <w:sz w:val="20"/>
+          <w:szCs w:val="20"/>
+        </w:rPr>
+        <w:t xml:space="preserve">        c.set();</w:t>
+      </w:r>
+    </w:p>
+    <w:p>
+      <w:pPr>
+        <w:rPr>
+          <w:rFonts w:ascii="Consolas" w:hAnsi="Consolas"/>
+          <w:sz w:val="20"/>
+          <w:szCs w:val="20"/>
+        </w:rPr>
+      </w:pPr>
+      <w:r>
+        <w:rPr>
+          <w:rFonts w:ascii="Consolas" w:hAnsi="Consolas"/>
+          <w:sz w:val="20"/>
+          <w:szCs w:val="20"/>
+        </w:rPr>
+        <w:t xml:space="preserve">        return 0;</w:t>
+      </w:r>
+    </w:p>
+    <w:p>
+      <w:pPr>
+        <w:rPr>
+          <w:rFonts w:ascii="Consolas" w:hAnsi="Consolas"/>
+          <w:sz w:val="20"/>
+          <w:szCs w:val="20"/>
+        </w:rPr>
+      </w:pPr>
+      <w:r>
+        <w:rPr>
+          <w:rFonts w:ascii="Consolas" w:hAnsi="Consolas"/>
+          <w:sz w:val="20"/>
+          <w:szCs w:val="20"/>
+        </w:rPr>
+        <w:t xml:space="preserve">}</w:t>
+      </w:r>
+    </w:p>
+    <w:p>
+      <w:pPr>
+        <w:rPr>
+          <w:sz w:val="24"/>
+          <w:szCs w:val="24"/>
+        </w:rPr>
+      </w:pPr>
+      <w:r>
+        <w:rPr>
+          <w:sz w:val="24"/>
+          <w:szCs w:val="24"/>
+        </w:rPr>
+        <w:t xml:space="preserve">IR Code Snippets in Q2e_struct_class.ll:</w:t>
+      </w:r>
+    </w:p>
+    <w:p>
+      <w:pPr>
+        <w:rPr>
+          <w:rFonts w:ascii="Consolas" w:hAnsi="Consolas"/>
+          <w:sz w:val="20"/>
+          <w:szCs w:val="20"/>
+        </w:rPr>
+      </w:pPr>
+      <w:r>
+        <w:rPr>
+          <w:rFonts w:ascii="Consolas" w:hAnsi="Consolas"/>
+          <w:sz w:val="20"/>
+          <w:szCs w:val="20"/>
+        </w:rPr>
+        <w:t xml:space="preserve">%struct.S = type { i32, i32 }</w:t>
+      </w:r>
+    </w:p>
+    <w:p>
+      <w:pPr>
+        <w:rPr>
+          <w:rFonts w:ascii="Consolas" w:hAnsi="Consolas"/>
+          <w:sz w:val="20"/>
+          <w:szCs w:val="20"/>
+        </w:rPr>
+      </w:pPr>
+      <w:r>
+        <w:rPr>
+          <w:rFonts w:ascii="Consolas" w:hAnsi="Consolas"/>
+          <w:sz w:val="20"/>
+          <w:szCs w:val="20"/>
+        </w:rPr>
+        <w:t xml:space="preserve">%class.C = type { i32, i32 }</w:t>
+      </w:r>
+    </w:p>
+    <w:p>
+      <w:pPr>
+        <w:rPr>
+          <w:rFonts w:ascii="Consolas" w:hAnsi="Consolas"/>
+          <w:sz w:val="20"/>
+          <w:szCs w:val="20"/>
+        </w:rPr>
+      </w:pPr>
+      <w:r>
+        <w:rPr>
+          <w:rFonts w:ascii="Consolas" w:hAnsi="Consolas"/>
+          <w:sz w:val="20"/>
+          <w:szCs w:val="20"/>
+        </w:rPr>
+        <w:t xml:space="preserve">%2 = alloca %struct.S, align 4</w:t>
+      </w:r>
+    </w:p>
+    <w:p>
+      <w:pPr>
+        <w:rPr>
+          <w:rFonts w:ascii="Consolas" w:hAnsi="Consolas"/>
+          <w:sz w:val="20"/>
+          <w:szCs w:val="20"/>
+        </w:rPr>
+      </w:pPr>
+      <w:r>
+        <w:rPr>
+          <w:rFonts w:ascii="Consolas" w:hAnsi="Consolas"/>
+          <w:sz w:val="20"/>
+          <w:szCs w:val="20"/>
+        </w:rPr>
+        <w:t xml:space="preserve">%3 = alloca %class.C, align 4</w:t>
+      </w:r>
+    </w:p>
+    <w:p>
+      <w:pPr>
+        <w:rPr>
+          <w:rFonts w:ascii="Consolas" w:hAnsi="Consolas"/>
+          <w:sz w:val="20"/>
+          <w:szCs w:val="20"/>
+        </w:rPr>
+      </w:pPr>
+      <w:r>
+        <w:rPr>
+          <w:rFonts w:ascii="Consolas" w:hAnsi="Consolas"/>
+          <w:sz w:val="20"/>
+          <w:szCs w:val="20"/>
+        </w:rPr>
+        <w:t xml:space="preserve">%4 = getelementptr inbounds %struct.S, ptr %2, i32 0, i32 0   ; s.x</w:t>
+      </w:r>
+    </w:p>
+    <w:p>
+      <w:pPr>
+        <w:rPr>
+          <w:rFonts w:ascii="Consolas" w:hAnsi="Consolas"/>
+          <w:sz w:val="20"/>
+          <w:szCs w:val="20"/>
+        </w:rPr>
+      </w:pPr>
+      <w:r>
+        <w:rPr>
+          <w:rFonts w:ascii="Consolas" w:hAnsi="Consolas"/>
+          <w:sz w:val="20"/>
+          <w:szCs w:val="20"/>
+        </w:rPr>
+        <w:t xml:space="preserve">call void @_ZN1C3setEv(ptr ... %3)                               ; c.set()</w:t>
+      </w:r>
+    </w:p>
+    <w:p>
+      <w:pPr>
+        <w:rPr>
+          <w:rFonts w:ascii="Consolas" w:hAnsi="Consolas"/>
+          <w:sz w:val="20"/>
+          <w:szCs w:val="20"/>
+        </w:rPr>
+      </w:pPr>
+      <w:r>
+        <w:rPr>
+          <w:rFonts w:ascii="Consolas" w:hAnsi="Consolas"/>
+          <w:sz w:val="20"/>
+          <w:szCs w:val="20"/>
+        </w:rPr>
+        <w:t xml:space="preserve">; body of C::set():</w:t>
+      </w:r>
+    </w:p>
+    <w:p>
+      <w:pPr>
+        <w:rPr>
+          <w:rFonts w:ascii="Consolas" w:hAnsi="Consolas"/>
+          <w:sz w:val="20"/>
+          <w:szCs w:val="20"/>
+        </w:rPr>
+      </w:pPr>
+      <w:r>
+        <w:rPr>
+          <w:rFonts w:ascii="Consolas" w:hAnsi="Consolas"/>
+          <w:sz w:val="20"/>
+          <w:szCs w:val="20"/>
+        </w:rPr>
+        <w:t xml:space="preserve">%4 = getelementptr inbounds %class.C, ptr %3, i32 0, i32 0</w:t>
+      </w:r>
+    </w:p>
+    <w:p>
+      <w:pPr>
+        <w:rPr>
+          <w:rFonts w:ascii="Consolas" w:hAnsi="Consolas"/>
+          <w:sz w:val="20"/>
+          <w:szCs w:val="20"/>
+        </w:rPr>
+      </w:pPr>
+      <w:r>
+        <w:rPr>
+          <w:rFonts w:ascii="Consolas" w:hAnsi="Consolas"/>
+          <w:sz w:val="20"/>
+          <w:szCs w:val="20"/>
+        </w:rPr>
+        <w:t xml:space="preserve">store i32 1, ptr %4, align 4</w:t>
+      </w:r>
+    </w:p>
+    <w:p>
+      <w:pPr>
+        <w:rPr>
+          <w:rFonts w:ascii="Consolas" w:hAnsi="Consolas"/>
+          <w:sz w:val="20"/>
+          <w:szCs w:val="20"/>
+        </w:rPr>
+      </w:pPr>
+      <w:r>
+        <w:rPr>
+          <w:rFonts w:ascii="Consolas" w:hAnsi="Consolas"/>
+          <w:sz w:val="20"/>
+          <w:szCs w:val="20"/>
+        </w:rPr>
+        <w:t xml:space="preserve">%5 = getelementptr inbounds %class.C, ptr %3, i32 0, i32 1</w:t>
+      </w:r>
+    </w:p>
+    <w:p>
+      <w:pPr>
+        <w:rPr>
+          <w:rFonts w:ascii="Consolas" w:hAnsi="Consolas"/>
+          <w:sz w:val="20"/>
+          <w:szCs w:val="20"/>
+        </w:rPr>
+      </w:pPr>
+      <w:r>
+        <w:rPr>
+          <w:rFonts w:ascii="Consolas" w:hAnsi="Consolas"/>
+          <w:sz w:val="20"/>
+          <w:szCs w:val="20"/>
+        </w:rPr>
+        <w:t xml:space="preserve">store i32 2, ptr %5, align 4</w:t>
+      </w:r>
+    </w:p>
+    <w:p>
+      <w:pPr>
+        <w:rPr>
+          <w:sz w:val="24"/>
+          <w:szCs w:val="24"/>
+        </w:rPr>
+      </w:pPr>
+      <w:r>
         <w:rPr>
           <w:b/>
           <w:bCs/>
           <w:sz w:val="24"/>
           <w:szCs w:val="24"/>
-          <w:u w:val="single"/>
-        </w:rPr>
-      </w:pPr>
-      <w:r>
+        </w:rPr>
+        <w:t xml:space="preserve">Explanation: </w:t>
+      </w:r>
+      <w:r>
+        <w:rPr>
+          <w:sz w:val="24"/>
+          <w:szCs w:val="24"/>
+        </w:rPr>
+        <w:t xml:space="preserve">Both types have the identical layout { i32, i32 }; the only visible difference is the name prefix (%struct. versus %class.), taken from the keyword used in the source. The private members of C are not marked in any way, and the member function set() is just a normal function with the object pointer as its first argument.</w:t>
+      </w:r>
+    </w:p>
+    <w:p>
+      <w:pPr>
         <w:rPr>
           <w:b/>
           <w:bCs/>
@@ -10898,22 +12149,577 @@
           <w:szCs w:val="24"/>
           <w:u w:val="single"/>
         </w:rPr>
+      </w:pPr>
+      <w:r>
+        <w:rPr>
+          <w:b/>
+          <w:bCs/>
+          <w:sz w:val="24"/>
+          <w:szCs w:val="24"/>
+          <w:u w:val="single"/>
+        </w:rPr>
+        <w:t xml:space="preserve">Answers to 3(b), 3(c), 3(d)</w:t>
+      </w:r>
+    </w:p>
+    <w:p>
+      <w:pPr>
+        <w:rPr>
+          <w:sz w:val="24"/>
+          <w:szCs w:val="24"/>
+        </w:rPr>
+      </w:pPr>
+      <w:r>
+        <w:rPr>
+          <w:sz w:val="24"/>
+          <w:szCs w:val="24"/>
+        </w:rPr>
+        <w:t xml:space="preserve">3(b) Difference between arrays and vectors in LLVM IR: A C array is a first-class IR aggregate type, [N x T], whose size is fixed at compile time. It is allocated in place (alloca [5 x i32]) and elements are addressed with getelementptr using two indices (0, i). A std::vector is a library class lowered to a struct of three pointers (24 bytes) whose elements live in separately allocated heap memory; it is used only through calls to member functions (constructor, push_back, operator[], destructor), and operator[] reads the begin pointer and applies a single-index getelementptr. (Separately, LLVM IR has a built-in SIMD type &lt;N x T&gt;, e.g. &lt;4 x i32&gt;, also called a vector type, but it is unrelated to std::vector and does not occur in this -O0 output.)</w:t>
+      </w:r>
+    </w:p>
+    <w:p>
+      <w:pPr>
+        <w:rPr>
+          <w:sz w:val="24"/>
+          <w:szCs w:val="24"/>
+        </w:rPr>
+      </w:pPr>
+      <w:r>
+        <w:rPr>
+          <w:sz w:val="24"/>
+          <w:szCs w:val="24"/>
+        </w:rPr>
+        <w:t xml:space="preserve">3(c) How the type of a union is determined in LLVM IR: Clang computes the union layout from its members: the member with the strictest alignment (the largest one when alignments are equal) becomes the single storage member, and the remaining bytes up to the size of the union are filled with an [N x i8] padding array. Here i (i32), f (float) and c (char[8], alignment 1) give %union.Data = type { i32, [4 x i8] }, i.e. size 8 and alignment 4, as required by c[8] and by i/f respectively.</w:t>
+      </w:r>
+    </w:p>
+    <w:p>
+      <w:pPr>
+        <w:rPr>
+          <w:sz w:val="24"/>
+          <w:szCs w:val="24"/>
+        </w:rPr>
+      </w:pPr>
+      <w:r>
+        <w:rPr>
+          <w:sz w:val="24"/>
+          <w:szCs w:val="24"/>
+        </w:rPr>
+        <w:t xml:space="preserve">3(d) Differences between struct and class once lowered to LLVM IR: There is essentially none structurally. Both lower to a named struct type with the same member layout, and the keyword only shows up as the name prefix (%struct.S versus %class.C). Default access (public for struct, private for class) is enforced by the frontend and does not appear in the IR at all; member functions are ordinary functions taking the object pointer as an extra first parameter. Differences in the IR only come from what a type contains (constructors, virtual functions, base classes), not from the struct/class keyword. The constructor of Q2bii.cpp is such a case: it appears as an additional function (_ZN5PointC2Ev).</w:t>
+      </w:r>
+    </w:p>
+    <w:p>
+      <w:pPr>
+        <w:rPr>
+          <w:b/>
+          <w:bCs/>
+          <w:sz w:val="24"/>
+          <w:szCs w:val="24"/>
+          <w:u w:val="single"/>
+        </w:rPr>
+      </w:pPr>
+      <w:r>
+        <w:rPr>
+          <w:b/>
+          <w:bCs/>
+          <w:sz w:val="24"/>
+          <w:szCs w:val="24"/>
+          <w:u w:val="single"/>
+        </w:rPr>
         <w:t xml:space="preserve">4. Floating-Point Representation in LLVM IR</w:t>
       </w:r>
     </w:p>
     <w:p>
       <w:pPr>
         <w:rPr>
-          <w:sz w:val="24"/>
-          <w:szCs w:val="24"/>
-        </w:rPr>
-      </w:pPr>
-      <w:r>
-        <w:rPr>
-          <w:sz w:val="24"/>
-          <w:szCs w:val="24"/>
-        </w:rPr>
-        <w:t xml:space="preserve">[TODO] Add code (Q4_float.c), IR snippets (Q4_float.ll); explain float/double types, fadd/fsub/fmul/fdiv/frem/fneg/fcmp, and fpext/fptrunc/fptosi/sitofp type lowering.</w:t>
+          <w:rFonts w:ascii="Consolas" w:hAnsi="Consolas"/>
+          <w:sz w:val="20"/>
+          <w:szCs w:val="20"/>
+        </w:rPr>
+      </w:pPr>
+      <w:r>
+        <w:rPr>
+          <w:rFonts w:ascii="Consolas" w:hAnsi="Consolas"/>
+          <w:sz w:val="20"/>
+          <w:szCs w:val="20"/>
+        </w:rPr>
+        <w:t xml:space="preserve">int main(){</w:t>
+      </w:r>
+    </w:p>
+    <w:p>
+      <w:pPr>
+        <w:rPr>
+          <w:rFonts w:ascii="Consolas" w:hAnsi="Consolas"/>
+          <w:sz w:val="20"/>
+          <w:szCs w:val="20"/>
+        </w:rPr>
+      </w:pPr>
+      <w:r>
+        <w:rPr>
+          <w:rFonts w:ascii="Consolas" w:hAnsi="Consolas"/>
+          <w:sz w:val="20"/>
+          <w:szCs w:val="20"/>
+        </w:rPr>
+        <w:t xml:space="preserve">        float f = 1.5f;</w:t>
+      </w:r>
+    </w:p>
+    <w:p>
+      <w:pPr>
+        <w:rPr>
+          <w:rFonts w:ascii="Consolas" w:hAnsi="Consolas"/>
+          <w:sz w:val="20"/>
+          <w:szCs w:val="20"/>
+        </w:rPr>
+      </w:pPr>
+      <w:r>
+        <w:rPr>
+          <w:rFonts w:ascii="Consolas" w:hAnsi="Consolas"/>
+          <w:sz w:val="20"/>
+          <w:szCs w:val="20"/>
+        </w:rPr>
+        <w:t xml:space="preserve">        double d = 2.5;</w:t>
+      </w:r>
+    </w:p>
+    <w:p>
+      <w:pPr>
+        <w:rPr>
+          <w:rFonts w:ascii="Consolas" w:hAnsi="Consolas"/>
+          <w:sz w:val="20"/>
+          <w:szCs w:val="20"/>
+        </w:rPr>
+      </w:pPr>
+      <w:r>
+        <w:rPr>
+          <w:rFonts w:ascii="Consolas" w:hAnsi="Consolas"/>
+          <w:sz w:val="20"/>
+          <w:szCs w:val="20"/>
+        </w:rPr>
+        <w:t xml:space="preserve">        d = d + f;               // fpext + fadd</w:t>
+      </w:r>
+    </w:p>
+    <w:p>
+      <w:pPr>
+        <w:rPr>
+          <w:rFonts w:ascii="Consolas" w:hAnsi="Consolas"/>
+          <w:sz w:val="20"/>
+          <w:szCs w:val="20"/>
+        </w:rPr>
+      </w:pPr>
+      <w:r>
+        <w:rPr>
+          <w:rFonts w:ascii="Consolas" w:hAnsi="Consolas"/>
+          <w:sz w:val="20"/>
+          <w:szCs w:val="20"/>
+        </w:rPr>
+        <w:t xml:space="preserve">        f = (float) d * f;       // fptrunc + fmul</w:t>
+      </w:r>
+    </w:p>
+    <w:p>
+      <w:pPr>
+        <w:rPr>
+          <w:rFonts w:ascii="Consolas" w:hAnsi="Consolas"/>
+          <w:sz w:val="20"/>
+          <w:szCs w:val="20"/>
+        </w:rPr>
+      </w:pPr>
+      <w:r>
+        <w:rPr>
+          <w:rFonts w:ascii="Consolas" w:hAnsi="Consolas"/>
+          <w:sz w:val="20"/>
+          <w:szCs w:val="20"/>
+        </w:rPr>
+        <w:t xml:space="preserve">        int i = (int) d;         // fptosi</w:t>
+      </w:r>
+    </w:p>
+    <w:p>
+      <w:pPr>
+        <w:rPr>
+          <w:rFonts w:ascii="Consolas" w:hAnsi="Consolas"/>
+          <w:sz w:val="20"/>
+          <w:szCs w:val="20"/>
+        </w:rPr>
+      </w:pPr>
+      <w:r>
+        <w:rPr>
+          <w:rFonts w:ascii="Consolas" w:hAnsi="Consolas"/>
+          <w:sz w:val="20"/>
+          <w:szCs w:val="20"/>
+        </w:rPr>
+        <w:t xml:space="preserve">        double e = i;            // sitofp</w:t>
+      </w:r>
+    </w:p>
+    <w:p>
+      <w:pPr>
+        <w:rPr>
+          <w:rFonts w:ascii="Consolas" w:hAnsi="Consolas"/>
+          <w:sz w:val="20"/>
+          <w:szCs w:val="20"/>
+        </w:rPr>
+      </w:pPr>
+      <w:r>
+        <w:rPr>
+          <w:rFonts w:ascii="Consolas" w:hAnsi="Consolas"/>
+          <w:sz w:val="20"/>
+          <w:szCs w:val="20"/>
+        </w:rPr>
+        <w:t xml:space="preserve">        if (f &lt; d) e = e / 2.0;  // fcmp + fdiv</w:t>
+      </w:r>
+    </w:p>
+    <w:p>
+      <w:pPr>
+        <w:rPr>
+          <w:rFonts w:ascii="Consolas" w:hAnsi="Consolas"/>
+          <w:sz w:val="20"/>
+          <w:szCs w:val="20"/>
+        </w:rPr>
+      </w:pPr>
+      <w:r>
+        <w:rPr>
+          <w:rFonts w:ascii="Consolas" w:hAnsi="Consolas"/>
+          <w:sz w:val="20"/>
+          <w:szCs w:val="20"/>
+        </w:rPr>
+        <w:t xml:space="preserve">        e = -e;                  // fneg</w:t>
+      </w:r>
+    </w:p>
+    <w:p>
+      <w:pPr>
+        <w:rPr>
+          <w:rFonts w:ascii="Consolas" w:hAnsi="Consolas"/>
+          <w:sz w:val="20"/>
+          <w:szCs w:val="20"/>
+        </w:rPr>
+      </w:pPr>
+      <w:r>
+        <w:rPr>
+          <w:rFonts w:ascii="Consolas" w:hAnsi="Consolas"/>
+          <w:sz w:val="20"/>
+          <w:szCs w:val="20"/>
+        </w:rPr>
+        <w:t xml:space="preserve">        return (int) e;</w:t>
+      </w:r>
+    </w:p>
+    <w:p>
+      <w:pPr>
+        <w:rPr>
+          <w:rFonts w:ascii="Consolas" w:hAnsi="Consolas"/>
+          <w:sz w:val="20"/>
+          <w:szCs w:val="20"/>
+        </w:rPr>
+      </w:pPr>
+      <w:r>
+        <w:rPr>
+          <w:rFonts w:ascii="Consolas" w:hAnsi="Consolas"/>
+          <w:sz w:val="20"/>
+          <w:szCs w:val="20"/>
+        </w:rPr>
+        <w:t xml:space="preserve">}</w:t>
+      </w:r>
+    </w:p>
+    <w:p>
+      <w:pPr>
+        <w:rPr>
+          <w:sz w:val="24"/>
+          <w:szCs w:val="24"/>
+        </w:rPr>
+      </w:pPr>
+      <w:r>
+        <w:rPr>
+          <w:sz w:val="24"/>
+          <w:szCs w:val="24"/>
+        </w:rPr>
+        <w:t xml:space="preserve">IR Code Snippets in Q4_float.ll:</w:t>
+      </w:r>
+    </w:p>
+    <w:p>
+      <w:pPr>
+        <w:rPr>
+          <w:rFonts w:ascii="Consolas" w:hAnsi="Consolas"/>
+          <w:sz w:val="20"/>
+          <w:szCs w:val="20"/>
+        </w:rPr>
+      </w:pPr>
+      <w:r>
+        <w:rPr>
+          <w:rFonts w:ascii="Consolas" w:hAnsi="Consolas"/>
+          <w:sz w:val="20"/>
+          <w:szCs w:val="20"/>
+        </w:rPr>
+        <w:t xml:space="preserve">%2 = alloca float, align 4</w:t>
+      </w:r>
+    </w:p>
+    <w:p>
+      <w:pPr>
+        <w:rPr>
+          <w:rFonts w:ascii="Consolas" w:hAnsi="Consolas"/>
+          <w:sz w:val="20"/>
+          <w:szCs w:val="20"/>
+        </w:rPr>
+      </w:pPr>
+      <w:r>
+        <w:rPr>
+          <w:rFonts w:ascii="Consolas" w:hAnsi="Consolas"/>
+          <w:sz w:val="20"/>
+          <w:szCs w:val="20"/>
+        </w:rPr>
+        <w:t xml:space="preserve">%3 = alloca double, align 8</w:t>
+      </w:r>
+    </w:p>
+    <w:p>
+      <w:pPr>
+        <w:rPr>
+          <w:rFonts w:ascii="Consolas" w:hAnsi="Consolas"/>
+          <w:sz w:val="20"/>
+          <w:szCs w:val="20"/>
+        </w:rPr>
+      </w:pPr>
+      <w:r>
+        <w:rPr>
+          <w:rFonts w:ascii="Consolas" w:hAnsi="Consolas"/>
+          <w:sz w:val="20"/>
+          <w:szCs w:val="20"/>
+        </w:rPr>
+        <w:t xml:space="preserve">store float 1.500000e+00, ptr %2, align 4</w:t>
+      </w:r>
+    </w:p>
+    <w:p>
+      <w:pPr>
+        <w:rPr>
+          <w:rFonts w:ascii="Consolas" w:hAnsi="Consolas"/>
+          <w:sz w:val="20"/>
+          <w:szCs w:val="20"/>
+        </w:rPr>
+      </w:pPr>
+      <w:r>
+        <w:rPr>
+          <w:rFonts w:ascii="Consolas" w:hAnsi="Consolas"/>
+          <w:sz w:val="20"/>
+          <w:szCs w:val="20"/>
+        </w:rPr>
+        <w:t xml:space="preserve">store double 2.500000e+00, ptr %3, align 8</w:t>
+      </w:r>
+    </w:p>
+    <w:p>
+      <w:pPr>
+        <w:rPr>
+          <w:rFonts w:ascii="Consolas" w:hAnsi="Consolas"/>
+          <w:sz w:val="20"/>
+          <w:szCs w:val="20"/>
+        </w:rPr>
+      </w:pPr>
+      <w:r>
+        <w:rPr>
+          <w:rFonts w:ascii="Consolas" w:hAnsi="Consolas"/>
+          <w:sz w:val="20"/>
+          <w:szCs w:val="20"/>
+        </w:rPr>
+        <w:t xml:space="preserve">%8 = fpext float %7 to double              ; float -&gt; double</w:t>
+      </w:r>
+    </w:p>
+    <w:p>
+      <w:pPr>
+        <w:rPr>
+          <w:rFonts w:ascii="Consolas" w:hAnsi="Consolas"/>
+          <w:sz w:val="20"/>
+          <w:szCs w:val="20"/>
+        </w:rPr>
+      </w:pPr>
+      <w:r>
+        <w:rPr>
+          <w:rFonts w:ascii="Consolas" w:hAnsi="Consolas"/>
+          <w:sz w:val="20"/>
+          <w:szCs w:val="20"/>
+        </w:rPr>
+        <w:t xml:space="preserve">%9 = fadd double %6, %8</w:t>
+      </w:r>
+    </w:p>
+    <w:p>
+      <w:pPr>
+        <w:rPr>
+          <w:rFonts w:ascii="Consolas" w:hAnsi="Consolas"/>
+          <w:sz w:val="20"/>
+          <w:szCs w:val="20"/>
+        </w:rPr>
+      </w:pPr>
+      <w:r>
+        <w:rPr>
+          <w:rFonts w:ascii="Consolas" w:hAnsi="Consolas"/>
+          <w:sz w:val="20"/>
+          <w:szCs w:val="20"/>
+        </w:rPr>
+        <w:t xml:space="preserve">%11 = fptrunc double %10 to float          ; double -&gt; float</w:t>
+      </w:r>
+    </w:p>
+    <w:p>
+      <w:pPr>
+        <w:rPr>
+          <w:rFonts w:ascii="Consolas" w:hAnsi="Consolas"/>
+          <w:sz w:val="20"/>
+          <w:szCs w:val="20"/>
+        </w:rPr>
+      </w:pPr>
+      <w:r>
+        <w:rPr>
+          <w:rFonts w:ascii="Consolas" w:hAnsi="Consolas"/>
+          <w:sz w:val="20"/>
+          <w:szCs w:val="20"/>
+        </w:rPr>
+        <w:t xml:space="preserve">%13 = fmul float %11, %12</w:t>
+      </w:r>
+    </w:p>
+    <w:p>
+      <w:pPr>
+        <w:rPr>
+          <w:rFonts w:ascii="Consolas" w:hAnsi="Consolas"/>
+          <w:sz w:val="20"/>
+          <w:szCs w:val="20"/>
+        </w:rPr>
+      </w:pPr>
+      <w:r>
+        <w:rPr>
+          <w:rFonts w:ascii="Consolas" w:hAnsi="Consolas"/>
+          <w:sz w:val="20"/>
+          <w:szCs w:val="20"/>
+        </w:rPr>
+        <w:t xml:space="preserve">%15 = fptosi double %14 to i32            ; double -&gt; int</w:t>
+      </w:r>
+    </w:p>
+    <w:p>
+      <w:pPr>
+        <w:rPr>
+          <w:rFonts w:ascii="Consolas" w:hAnsi="Consolas"/>
+          <w:sz w:val="20"/>
+          <w:szCs w:val="20"/>
+        </w:rPr>
+      </w:pPr>
+      <w:r>
+        <w:rPr>
+          <w:rFonts w:ascii="Consolas" w:hAnsi="Consolas"/>
+          <w:sz w:val="20"/>
+          <w:szCs w:val="20"/>
+        </w:rPr>
+        <w:t xml:space="preserve">%17 = sitofp i32 %16 to double            ; int -&gt; double</w:t>
+      </w:r>
+    </w:p>
+    <w:p>
+      <w:pPr>
+        <w:rPr>
+          <w:rFonts w:ascii="Consolas" w:hAnsi="Consolas"/>
+          <w:sz w:val="20"/>
+          <w:szCs w:val="20"/>
+        </w:rPr>
+      </w:pPr>
+      <w:r>
+        <w:rPr>
+          <w:rFonts w:ascii="Consolas" w:hAnsi="Consolas"/>
+          <w:sz w:val="20"/>
+          <w:szCs w:val="20"/>
+        </w:rPr>
+        <w:t xml:space="preserve">%21 = fcmp olt double %19, %20            ; f &lt; d</w:t>
+      </w:r>
+    </w:p>
+    <w:p>
+      <w:pPr>
+        <w:rPr>
+          <w:rFonts w:ascii="Consolas" w:hAnsi="Consolas"/>
+          <w:sz w:val="20"/>
+          <w:szCs w:val="20"/>
+        </w:rPr>
+      </w:pPr>
+      <w:r>
+        <w:rPr>
+          <w:rFonts w:ascii="Consolas" w:hAnsi="Consolas"/>
+          <w:sz w:val="20"/>
+          <w:szCs w:val="20"/>
+        </w:rPr>
+        <w:t xml:space="preserve">%24 = fdiv double %23, 2.000000e+00</w:t>
+      </w:r>
+    </w:p>
+    <w:p>
+      <w:pPr>
+        <w:rPr>
+          <w:rFonts w:ascii="Consolas" w:hAnsi="Consolas"/>
+          <w:sz w:val="20"/>
+          <w:szCs w:val="20"/>
+        </w:rPr>
+      </w:pPr>
+      <w:r>
+        <w:rPr>
+          <w:rFonts w:ascii="Consolas" w:hAnsi="Consolas"/>
+          <w:sz w:val="20"/>
+          <w:szCs w:val="20"/>
+        </w:rPr>
+        <w:t xml:space="preserve">%27 = fneg double %26</w:t>
+      </w:r>
+    </w:p>
+    <w:p>
+      <w:pPr>
+        <w:rPr>
+          <w:sz w:val="24"/>
+          <w:szCs w:val="24"/>
+        </w:rPr>
+      </w:pPr>
+      <w:r>
+        <w:rPr>
+          <w:b/>
+          <w:bCs/>
+          <w:sz w:val="24"/>
+          <w:szCs w:val="24"/>
+        </w:rPr>
+        <w:t xml:space="preserve">Explanation: </w:t>
+      </w:r>
+      <w:r>
+        <w:rPr>
+          <w:sz w:val="24"/>
+          <w:szCs w:val="24"/>
+        </w:rPr>
+        <w:t xml:space="preserve">Representation: LLVM has fixed-width floating-point types: half, bfloat, float (32 bit), double (64 bit), x86_fp80, fp128 and ppc_fp128. C float and double map to float and double. Constants are written as decimal (1.500000e+00) when exactly representable, and otherwise as a hexadecimal bit pattern; a float constant is written using the bit pattern of its value widened to double, e.g. 0.1f becomes 0x3FB99999A0000000.</w:t>
+      </w:r>
+    </w:p>
+    <w:p>
+      <w:pPr>
+        <w:rPr>
+          <w:sz w:val="24"/>
+          <w:szCs w:val="24"/>
+        </w:rPr>
+      </w:pPr>
+      <w:r>
+        <w:rPr>
+          <w:b/>
+          <w:bCs/>
+          <w:sz w:val="24"/>
+          <w:szCs w:val="24"/>
+        </w:rPr>
+        <w:t xml:space="preserve">Explanation: </w:t>
+      </w:r>
+      <w:r>
+        <w:rPr>
+          <w:sz w:val="24"/>
+          <w:szCs w:val="24"/>
+        </w:rPr>
+        <w:t xml:space="preserve">Operations: fadd, fsub, fmul, fdiv, frem and fneg work on floating-point values (both operands must have the same type). Comparison is done with fcmp, whose predicate is either ordered (oeq, ogt, oge, olt, ole, one: false if an operand is NaN) or unordered (ueq, ugt, ..., une: true if an operand is NaN); Clang emits olt for &lt; and une for !=. fcmp produces an i1 that feeds a br instruction.</w:t>
+      </w:r>
+    </w:p>
+    <w:p>
+      <w:pPr>
+        <w:rPr>
+          <w:sz w:val="24"/>
+          <w:szCs w:val="24"/>
+        </w:rPr>
+      </w:pPr>
+      <w:r>
+        <w:rPr>
+          <w:b/>
+          <w:bCs/>
+          <w:sz w:val="24"/>
+          <w:szCs w:val="24"/>
+        </w:rPr>
+        <w:t xml:space="preserve">Explanation: </w:t>
+      </w:r>
+      <w:r>
+        <w:rPr>
+          <w:sz w:val="24"/>
+          <w:szCs w:val="24"/>
+        </w:rPr>
+        <w:t xml:space="preserve">Type lowering: LLVM IR has no implicit conversions, so Clang makes every C conversion explicit. In d + f, the float is first widened with fpext to double (usual arithmetic conversions); (float) d is a fptrunc; float to integer is fptosi (fptoui for unsigned) and integer to float is sitofp (uitofp for unsigned). When lowered further with llc (Q4_float.s) these become x86-64 SSE instructions: float arithmetic uses the ss forms (mulss), double arithmetic the sd forms (addsd, divsd), fpext/fptrunc become cvtss2sd/cvtsd2ss, fptosi/sitofp become cvttsd2si/cvtsi2sd, fcmp becomes ucomisd followed by a conditional jump, and fneg flips the sign bit using an xor.</w:t>
       </w:r>
     </w:p>
     <w:p>
@@ -25951,6 +27757,102 @@
           <w:szCs w:val="20"/>
         </w:rPr>
         <w:t>!4 = !{!"Ubuntu clang version 18.1.3 (1ubuntu1)"}</w:t>
+      </w:r>
+    </w:p>
+    <w:p>
+      <w:pPr>
+        <w:rPr>
+          <w:b/>
+          <w:bCs/>
+          <w:sz w:val="24"/>
+          <w:szCs w:val="24"/>
+          <w:u w:val="single"/>
+        </w:rPr>
+      </w:pPr>
+      <w:r>
+        <w:rPr>
+          <w:b/>
+          <w:bCs/>
+          <w:sz w:val="24"/>
+          <w:szCs w:val="24"/>
+          <w:u w:val="single"/>
+        </w:rPr>
+        <w:t xml:space="preserve">References</w:t>
+      </w:r>
+    </w:p>
+    <w:p>
+      <w:pPr>
+        <w:rPr>
+          <w:sz w:val="24"/>
+          <w:szCs w:val="24"/>
+        </w:rPr>
+      </w:pPr>
+      <w:r>
+        <w:rPr>
+          <w:sz w:val="24"/>
+          <w:szCs w:val="24"/>
+        </w:rPr>
+        <w:t xml:space="preserve">[1] LLVM Project, "LLVM Language Reference Manual", https://llvm.org/docs/LangRef.html</w:t>
+      </w:r>
+    </w:p>
+    <w:p>
+      <w:pPr>
+        <w:rPr>
+          <w:sz w:val="24"/>
+          <w:szCs w:val="24"/>
+        </w:rPr>
+      </w:pPr>
+      <w:r>
+        <w:rPr>
+          <w:sz w:val="24"/>
+          <w:szCs w:val="24"/>
+        </w:rPr>
+        <w:t xml:space="preserve">[2] LLVM Project, "Getting Started with the LLVM System" (directory layout, building from source), https://llvm.org/docs/GettingStarted.html</w:t>
+      </w:r>
+    </w:p>
+    <w:p>
+      <w:pPr>
+        <w:rPr>
+          <w:sz w:val="24"/>
+          <w:szCs w:val="24"/>
+        </w:rPr>
+      </w:pPr>
+      <w:r>
+        <w:rPr>
+          <w:sz w:val="24"/>
+          <w:szCs w:val="24"/>
+        </w:rPr>
+        <w:t xml:space="preserve">[3] LLVM Project, "Clang documentation", https://clang.llvm.org/docs/</w:t>
+      </w:r>
+    </w:p>
+    <w:p>
+      <w:pPr>
+        <w:rPr>
+          <w:sz w:val="24"/>
+          <w:szCs w:val="24"/>
+        </w:rPr>
+      </w:pPr>
+      <w:r>
+        <w:rPr>
+          <w:sz w:val="24"/>
+          <w:szCs w:val="24"/>
+        </w:rPr>
+        <w:t xml:space="preserve">[4] LLVM Project, "The Often Misunderstood GEP Instruction", https://llvm.org/docs/GetElementPtr.html</w:t>
+      </w:r>
+    </w:p>
+    <w:p>
+      <w:pPr>
+        <w:rPr>
+          <w:sz w:val="24"/>
+          <w:szCs w:val="24"/>
+        </w:rPr>
+      </w:pPr>
+      <w:r>
+        <w:rPr>
+          <w:sz w:val="24"/>
+          <w:szCs w:val="24"/>
+        </w:rPr>
+        <w:t xml:space="preserve">[5] Source files and generated outputs of this report: https://github.com/Rmuk655/Compiler-Construction/tree/main/LLVM-IR-Explorer</w:t>
       </w:r>
     </w:p>
     <w:sectPr>

</xml_diff>